<commit_message>
Clarify technical formulation in bilingual four-page proposals
</commit_message>
<xml_diff>
--- a/docs/project-plan/submission/Project_Plan_EN.docx
+++ b/docs/project-plan/submission/Project_Plan_EN.docx
@@ -2,7 +2,7 @@
 <file path=word/document.xml><?xml version="1.0" encoding="utf-8"?>
 <w:document xmlns:w="http://schemas.openxmlformats.org/wordprocessingml/2006/main" xmlns:m="http://schemas.openxmlformats.org/officeDocument/2006/math" xmlns:r="http://schemas.openxmlformats.org/officeDocument/2006/relationships" xmlns:o="urn:schemas-microsoft-com:office:office" xmlns:v="urn:schemas-microsoft-com:vml" xmlns:w10="urn:schemas-microsoft-com:office:word" xmlns:a="http://schemas.openxmlformats.org/drawingml/2006/main" xmlns:pic="http://schemas.openxmlformats.org/drawingml/2006/picture" xmlns:wp="http://schemas.openxmlformats.org/drawingml/2006/wordprocessingDrawing">
   <w:body>
-    <w:bookmarkStart w:id="50" w:name="keeping-the-topic-widening-the-view"/>
+    <w:bookmarkStart w:id="49" w:name="keeping-the-topic-widening-the-view"/>
     <w:p>
       <w:pPr>
         <w:pStyle w:val="Title"/>
@@ -413,11 +413,11 @@
         <w:widowControl/>
       </w:pPr>
       <w:r>
-        <w:t xml:space="preserve">The method will be developed across at least two issues and evaluated on another issue not used in development. Our main outputs will be an evidence-based report design, a comparison of intervention strategies and a dynamic simulation. A small tool may demonstrate the process, but a finished app is not required. We will study exposure and control, rather than claim to measure changes in users’ beliefs or well-being.</w:t>
+        <w:t xml:space="preserve">We will develop the method across at least two issues and evaluate it on a held-out issue. Our main outputs will be an evidence-based report design, a comparison of adaptive intervention policies and a dynamic simulation. An optional tool may demonstrate the process. We will study exposure and control, rather than claim to measure changes in users’ beliefs or well-being.</w:t>
       </w:r>
     </w:p>
     <w:bookmarkEnd w:id="20"/>
-    <w:bookmarkStart w:id="25" w:name="computing-and-data-science-approach"/>
+    <w:bookmarkStart w:id="24" w:name="computing-and-data-science-approach"/>
     <w:p>
       <w:pPr>
         <w:pStyle w:val="Heading1"/>
@@ -433,7 +433,7 @@
         <w:widowControl/>
       </w:pPr>
       <w:r>
-        <w:t xml:space="preserve">This is a</w:t>
+        <w:t xml:space="preserve">This hybrid project uses</w:t>
       </w:r>
       <w:r>
         <w:t xml:space="preserve"> </w:t>
@@ -443,20 +443,55 @@
           <w:bCs/>
           <w:b/>
         </w:rPr>
-        <w:t xml:space="preserve">hybrid project combining data analysis, algorithmic design and simulation</w:t>
-      </w:r>
-      <w:r>
-        <w:t xml:space="preserve">. Its technical core is selecting interventions that preserve useful information, then examining their effects within a recommendation–feedback loop. We will use existing methods where they fit the task.</w:t>
-      </w:r>
-    </w:p>
-    <w:bookmarkStart w:id="21" w:name="understand-the-content"/>
+        <w:t xml:space="preserve">data analysis</w:t>
+      </w:r>
+      <w:r>
+        <w:t xml:space="preserve"> </w:t>
+      </w:r>
+      <w:r>
+        <w:t xml:space="preserve">to describe what users encounter,</w:t>
+      </w:r>
+      <w:r>
+        <w:t xml:space="preserve"> </w:t>
+      </w:r>
+      <w:r>
+        <w:rPr>
+          <w:bCs/>
+          <w:b/>
+        </w:rPr>
+        <w:t xml:space="preserve">algorithmic design</w:t>
+      </w:r>
+      <w:r>
+        <w:t xml:space="preserve"> </w:t>
+      </w:r>
+      <w:r>
+        <w:t xml:space="preserve">to select actions under information-retention and effort constraints, and</w:t>
+      </w:r>
+      <w:r>
+        <w:t xml:space="preserve"> </w:t>
+      </w:r>
+      <w:r>
+        <w:rPr>
+          <w:bCs/>
+          <w:b/>
+        </w:rPr>
+        <w:t xml:space="preserve">simulation</w:t>
+      </w:r>
+      <w:r>
+        <w:t xml:space="preserve"> </w:t>
+      </w:r>
+      <w:r>
+        <w:t xml:space="preserve">to test how those actions affect subsequent recommendations. We will reuse established methods where suitable.</w:t>
+      </w:r>
+    </w:p>
+    <w:bookmarkStart w:id="21" w:name="X76e014de3e4b83a34c3c5c1caadabd39187a253"/>
     <w:p>
       <w:pPr>
         <w:pStyle w:val="Heading2"/>
         <w:widowControl/>
       </w:pPr>
       <w:r>
-        <w:t xml:space="preserve">Understand the content</w:t>
+        <w:t xml:space="preserve">Data analysis: measuring viewpoint exposure</w:t>
       </w:r>
     </w:p>
     <w:p>
@@ -465,7 +500,493 @@
         <w:widowControl/>
       </w:pPr>
       <w:r>
-        <w:t xml:space="preserve">We will retrieve relevant videos using keyword and semantic search, then identify the specific claim, the speaker’s stance, supporting reasons and the evidence available in the video. Large language models (LLMs) can analyse titles and transcripts; vision–language models (VLMs) can interpret frames or video clips when dialogue, subtitles or visual context matter. A character’s line in a sketch must not automatically become the creator’s opinion.</w:t>
+        <w:t xml:space="preserve">The tool sees content and interaction records</w:t>
+      </w:r>
+      <w:r>
+        <w:t xml:space="preserve"> </w:t>
+      </w:r>
+      <m:oMath>
+        <m:sSub>
+          <m:e>
+            <m:r>
+              <m:t>o</m:t>
+            </m:r>
+          </m:e>
+          <m:sub>
+            <m:r>
+              <m:rPr>
+                <m:sty m:val="p"/>
+              </m:rPr>
+              <m:t>≤</m:t>
+            </m:r>
+            <m:r>
+              <m:t>t</m:t>
+            </m:r>
+          </m:sub>
+        </m:sSub>
+      </m:oMath>
+      <w:r>
+        <w:t xml:space="preserve"> </w:t>
+      </w:r>
+      <w:r>
+        <w:t xml:space="preserve">available up to step</w:t>
+      </w:r>
+      <w:r>
+        <w:t xml:space="preserve"> </w:t>
+      </w:r>
+      <m:oMath>
+        <m:r>
+          <m:t>t</m:t>
+        </m:r>
+      </m:oMath>
+      <w:r>
+        <w:t xml:space="preserve">, not the platform’s internal state. Keyword and semantic retrieval, followed by large language model (LLM) or vision–language model (VLM) analysis, will extract claims, stances, reasons and source identifiers with supporting passages or timestamps. The analysis pipeline produces an exposure summary:</w:t>
+      </w:r>
+    </w:p>
+    <w:p>
+      <w:pPr>
+        <w:pStyle w:val="BodyText"/>
+        <w:keepNext/>
+        <w:widowControl/>
+      </w:pPr>
+      <m:oMathPara>
+        <m:oMathParaPr>
+          <m:jc m:val="center"/>
+        </m:oMathParaPr>
+        <m:oMath>
+          <m:sSub>
+            <m:e>
+              <m:acc>
+                <m:accPr>
+                  <m:chr m:val="̂"/>
+                </m:accPr>
+                <m:e>
+                  <m:r>
+                    <m:t>e</m:t>
+                  </m:r>
+                </m:e>
+              </m:acc>
+            </m:e>
+            <m:sub>
+              <m:r>
+                <m:t>t</m:t>
+              </m:r>
+            </m:sub>
+          </m:sSub>
+          <m:r>
+            <m:rPr>
+              <m:sty m:val="p"/>
+            </m:rPr>
+            <m:t>=</m:t>
+          </m:r>
+          <m:r>
+            <m:t>Φ</m:t>
+          </m:r>
+          <m:d>
+            <m:dPr>
+              <m:begChr m:val="("/>
+              <m:endChr m:val=")"/>
+              <m:sepChr m:val=""/>
+              <m:grow/>
+            </m:dPr>
+            <m:e>
+              <m:sSub>
+                <m:e>
+                  <m:r>
+                    <m:t>o</m:t>
+                  </m:r>
+                </m:e>
+                <m:sub>
+                  <m:r>
+                    <m:rPr>
+                      <m:sty m:val="p"/>
+                    </m:rPr>
+                    <m:t>≤</m:t>
+                  </m:r>
+                  <m:r>
+                    <m:t>t</m:t>
+                  </m:r>
+                </m:sub>
+              </m:sSub>
+            </m:e>
+          </m:d>
+          <m:r>
+            <m:rPr>
+              <m:sty m:val="p"/>
+            </m:rPr>
+            <m:t>=</m:t>
+          </m:r>
+          <m:d>
+            <m:dPr>
+              <m:begChr m:val="("/>
+              <m:endChr m:val=")"/>
+              <m:sepChr m:val=""/>
+              <m:grow/>
+            </m:dPr>
+            <m:e>
+              <m:sSub>
+                <m:e>
+                  <m:r>
+                    <m:t>p</m:t>
+                  </m:r>
+                </m:e>
+                <m:sub>
+                  <m:r>
+                    <m:t>t</m:t>
+                  </m:r>
+                </m:sub>
+              </m:sSub>
+              <m:r>
+                <m:rPr>
+                  <m:sty m:val="p"/>
+                </m:rPr>
+                <m:t>,</m:t>
+              </m:r>
+              <m:sSub>
+                <m:e>
+                  <m:r>
+                    <m:rPr>
+                      <m:sty m:val="b"/>
+                    </m:rPr>
+                    <m:t>r</m:t>
+                  </m:r>
+                </m:e>
+                <m:sub>
+                  <m:r>
+                    <m:t>t</m:t>
+                  </m:r>
+                </m:sub>
+              </m:sSub>
+              <m:r>
+                <m:rPr>
+                  <m:sty m:val="p"/>
+                </m:rPr>
+                <m:t>,</m:t>
+              </m:r>
+              <m:sSub>
+                <m:e>
+                  <m:r>
+                    <m:t>d</m:t>
+                  </m:r>
+                </m:e>
+                <m:sub>
+                  <m:r>
+                    <m:t>t</m:t>
+                  </m:r>
+                </m:sub>
+              </m:sSub>
+              <m:r>
+                <m:rPr>
+                  <m:sty m:val="p"/>
+                </m:rPr>
+                <m:t>,</m:t>
+              </m:r>
+              <m:sSub>
+                <m:e>
+                  <m:r>
+                    <m:t>u</m:t>
+                  </m:r>
+                </m:e>
+                <m:sub>
+                  <m:r>
+                    <m:t>t</m:t>
+                  </m:r>
+                </m:sub>
+              </m:sSub>
+            </m:e>
+          </m:d>
+          <m:r>
+            <m:rPr>
+              <m:sty m:val="p"/>
+            </m:rPr>
+            <m:t>.</m:t>
+          </m:r>
+        </m:oMath>
+      </m:oMathPara>
+    </w:p>
+    <w:p>
+      <w:pPr>
+        <w:pStyle w:val="FirstParagraph"/>
+        <w:widowControl/>
+      </w:pPr>
+      <w:r>
+        <w:t xml:space="preserve">Here</w:t>
+      </w:r>
+      <w:r>
+        <w:t xml:space="preserve"> </w:t>
+      </w:r>
+      <m:oMath>
+        <m:sSub>
+          <m:e>
+            <m:r>
+              <m:t>p</m:t>
+            </m:r>
+          </m:e>
+          <m:sub>
+            <m:r>
+              <m:t>t</m:t>
+            </m:r>
+          </m:sub>
+        </m:sSub>
+      </m:oMath>
+      <w:r>
+        <w:t xml:space="preserve"> </w:t>
+      </w:r>
+      <w:r>
+        <w:t xml:space="preserve">is the stance distribution for a defined claim, excluding unknown labels,</w:t>
+      </w:r>
+      <w:r>
+        <w:t xml:space="preserve"> </w:t>
+      </w:r>
+      <m:oMath>
+        <m:sSub>
+          <m:e>
+            <m:r>
+              <m:rPr>
+                <m:sty m:val="b"/>
+              </m:rPr>
+              <m:t>r</m:t>
+            </m:r>
+          </m:e>
+          <m:sub>
+            <m:r>
+              <m:t>t</m:t>
+            </m:r>
+          </m:sub>
+        </m:sSub>
+      </m:oMath>
+      <w:r>
+        <w:t xml:space="preserve"> </w:t>
+      </w:r>
+      <w:r>
+        <w:t xml:space="preserve">gives reason coverage,</w:t>
+      </w:r>
+      <w:r>
+        <w:t xml:space="preserve"> </w:t>
+      </w:r>
+      <m:oMath>
+        <m:sSub>
+          <m:e>
+            <m:r>
+              <m:t>d</m:t>
+            </m:r>
+          </m:e>
+          <m:sub>
+            <m:r>
+              <m:t>t</m:t>
+            </m:r>
+          </m:sub>
+        </m:sSub>
+      </m:oMath>
+      <w:r>
+        <w:t xml:space="preserve"> </w:t>
+      </w:r>
+      <w:r>
+        <w:t xml:space="preserve">source repetition, and</w:t>
+      </w:r>
+      <w:r>
+        <w:t xml:space="preserve"> </w:t>
+      </w:r>
+      <m:oMath>
+        <m:sSub>
+          <m:e>
+            <m:r>
+              <m:t>u</m:t>
+            </m:r>
+          </m:e>
+          <m:sub>
+            <m:r>
+              <m:t>t</m:t>
+            </m:r>
+          </m:sub>
+        </m:sSub>
+      </m:oMath>
+      <w:r>
+        <w:t xml:space="preserve"> </w:t>
+      </w:r>
+      <w:r>
+        <w:t xml:space="preserve">the unknown-label proportion. Sliding windows track two properties: concentration and change. Shannon entropy</w:t>
+      </w:r>
+      <w:r>
+        <w:t xml:space="preserve"> </w:t>
+      </w:r>
+      <m:oMath>
+        <m:r>
+          <m:t>H</m:t>
+        </m:r>
+        <m:d>
+          <m:dPr>
+            <m:begChr m:val="("/>
+            <m:endChr m:val=")"/>
+            <m:sepChr m:val=""/>
+            <m:grow/>
+          </m:dPr>
+          <m:e>
+            <m:sSub>
+              <m:e>
+                <m:r>
+                  <m:t>p</m:t>
+                </m:r>
+              </m:e>
+              <m:sub>
+                <m:r>
+                  <m:t>t</m:t>
+                </m:r>
+              </m:sub>
+            </m:sSub>
+          </m:e>
+        </m:d>
+        <m:r>
+          <m:rPr>
+            <m:sty m:val="p"/>
+          </m:rPr>
+          <m:t>=</m:t>
+        </m:r>
+        <m:r>
+          <m:rPr>
+            <m:sty m:val="p"/>
+          </m:rPr>
+          <m:t>−</m:t>
+        </m:r>
+        <m:nary>
+          <m:naryPr>
+            <m:chr m:val="∑"/>
+            <m:limLoc m:val="undOvr"/>
+            <m:subHide m:val="off"/>
+            <m:supHide m:val="on"/>
+          </m:naryPr>
+          <m:sub>
+            <m:r>
+              <m:t>k</m:t>
+            </m:r>
+          </m:sub>
+          <m:sup>
+            <m:r>
+              <m:t>​</m:t>
+            </m:r>
+          </m:sup>
+          <m:e>
+            <m:sSub>
+              <m:e>
+                <m:r>
+                  <m:t>p</m:t>
+                </m:r>
+              </m:e>
+              <m:sub>
+                <m:r>
+                  <m:t>t</m:t>
+                </m:r>
+                <m:r>
+                  <m:rPr>
+                    <m:sty m:val="p"/>
+                  </m:rPr>
+                  <m:t>,</m:t>
+                </m:r>
+                <m:r>
+                  <m:t>k</m:t>
+                </m:r>
+              </m:sub>
+            </m:sSub>
+          </m:e>
+        </m:nary>
+        <m:r>
+          <m:rPr>
+            <m:sty m:val="p"/>
+          </m:rPr>
+          <m:t>log</m:t>
+        </m:r>
+        <m:sSub>
+          <m:e>
+            <m:r>
+              <m:t>p</m:t>
+            </m:r>
+          </m:e>
+          <m:sub>
+            <m:r>
+              <m:t>t</m:t>
+            </m:r>
+            <m:r>
+              <m:rPr>
+                <m:sty m:val="p"/>
+              </m:rPr>
+              <m:t>,</m:t>
+            </m:r>
+            <m:r>
+              <m:t>k</m:t>
+            </m:r>
+          </m:sub>
+        </m:sSub>
+      </m:oMath>
+      <w:r>
+        <w:t xml:space="preserve"> </w:t>
+      </w:r>
+      <w:r>
+        <w:t xml:space="preserve">measures concentration, with lower values indicating exposure concentrated in fewer stances. Jensen–Shannon divergence</w:t>
+      </w:r>
+      <w:r>
+        <w:t xml:space="preserve"> </w:t>
+      </w:r>
+      <m:oMath>
+        <m:r>
+          <m:rPr>
+            <m:sty m:val="p"/>
+          </m:rPr>
+          <m:t>J</m:t>
+        </m:r>
+        <m:r>
+          <m:rPr>
+            <m:sty m:val="p"/>
+          </m:rPr>
+          <m:t>S</m:t>
+        </m:r>
+        <m:d>
+          <m:dPr>
+            <m:begChr m:val="("/>
+            <m:endChr m:val=")"/>
+            <m:sepChr m:val=""/>
+            <m:grow/>
+          </m:dPr>
+          <m:e>
+            <m:sSub>
+              <m:e>
+                <m:r>
+                  <m:t>p</m:t>
+                </m:r>
+              </m:e>
+              <m:sub>
+                <m:r>
+                  <m:t>t</m:t>
+                </m:r>
+              </m:sub>
+            </m:sSub>
+            <m:r>
+              <m:rPr>
+                <m:sty m:val="p"/>
+              </m:rPr>
+              <m:t>,</m:t>
+            </m:r>
+            <m:r>
+              <m:t>q</m:t>
+            </m:r>
+          </m:e>
+        </m:d>
+      </m:oMath>
+      <w:r>
+        <w:t xml:space="preserve"> </w:t>
+      </w:r>
+      <w:r>
+        <w:t xml:space="preserve">measures difference from an explicit reference</w:t>
+      </w:r>
+      <w:r>
+        <w:t xml:space="preserve"> </w:t>
+      </w:r>
+      <m:oMath>
+        <m:r>
+          <m:t>q</m:t>
+        </m:r>
+      </m:oMath>
+      <w:r>
+        <w:t xml:space="preserve">, such as earlier exposure. Neither establishes harm or implies that uniform exposure is ideal.</w:t>
       </w:r>
     </w:p>
     <w:p>
@@ -474,36 +995,18 @@
         <w:widowControl/>
       </w:pPr>
       <w:r>
-        <w:t xml:space="preserve">Model outputs will include supporting passages or video segments and an</w:t>
-      </w:r>
-      <w:r>
-        <w:t xml:space="preserve"> </w:t>
-      </w:r>
-      <w:r>
-        <w:t xml:space="preserve">“</w:t>
-      </w:r>
-      <w:r>
-        <w:t xml:space="preserve">uncertain</w:t>
-      </w:r>
-      <w:r>
-        <w:t xml:space="preserve">”</w:t>
-      </w:r>
-      <w:r>
-        <w:t xml:space="preserve"> </w:t>
-      </w:r>
-      <w:r>
-        <w:t xml:space="preserve">option. Two members will independently label an evaluation sample, resolve or retain disagreements, and check model errors. Comparing titles alone with transcripts and audiovisual input will show when extra context is useful. Retrieval errors will also be checked, including relevant videos missed by the initial search.</w:t>
+        <w:t xml:space="preserve">Independent double annotation, precision/recall, modality comparisons and a held-out issue will test measurement quality; sparse histories will remain unscored. Disagreements and alternative plausible labels for uncertain items will test whether classification errors change the conclusions.</w:t>
       </w:r>
     </w:p>
     <w:bookmarkEnd w:id="21"/>
-    <w:bookmarkStart w:id="22" w:name="describe-exposure"/>
+    <w:bookmarkStart w:id="22" w:name="X42887eb3a8026c7aa62ba3c46757eb921113d15"/>
     <w:p>
       <w:pPr>
         <w:pStyle w:val="Heading2"/>
         <w:widowControl/>
       </w:pPr>
       <w:r>
-        <w:t xml:space="preserve">Describe exposure</w:t>
+        <w:t xml:space="preserve">Algorithmic design: selecting interventions</w:t>
       </w:r>
     </w:p>
     <w:p>
@@ -512,25 +1015,584 @@
         <w:widowControl/>
       </w:pPr>
       <w:r>
-        <w:t xml:space="preserve">For each issue, we will summarise the distribution of stances, recurring reasons, repeated source material and changes over time. Comparison baselines might include the user’s earlier feed or a documented collection of relevant arguments; neither automatically represents the</w:t>
-      </w:r>
-      <w:r>
-        <w:t xml:space="preserve"> </w:t>
-      </w:r>
-      <w:r>
-        <w:t xml:space="preserve">“</w:t>
-      </w:r>
-      <w:r>
-        <w:t xml:space="preserve">correct</w:t>
-      </w:r>
-      <w:r>
-        <w:t xml:space="preserve">”</w:t>
-      </w:r>
-      <w:r>
-        <w:t xml:space="preserve"> </w:t>
-      </w:r>
-      <w:r>
-        <w:t xml:space="preserve">distribution. The report will show missing information and uncertain labels rather than combine everything into a single filter-bubble score.</w:t>
+        <w:t xml:space="preserve">An action-selection policy chooses</w:t>
+      </w:r>
+      <w:r>
+        <w:t xml:space="preserve"> </w:t>
+      </w:r>
+      <m:oMath>
+        <m:sSub>
+          <m:e>
+            <m:r>
+              <m:t>a</m:t>
+            </m:r>
+          </m:e>
+          <m:sub>
+            <m:r>
+              <m:t>t</m:t>
+            </m:r>
+          </m:sub>
+        </m:sSub>
+        <m:r>
+          <m:rPr>
+            <m:sty m:val="p"/>
+          </m:rPr>
+          <m:t>=</m:t>
+        </m:r>
+        <m:r>
+          <m:t>π</m:t>
+        </m:r>
+        <m:d>
+          <m:dPr>
+            <m:begChr m:val="("/>
+            <m:endChr m:val=")"/>
+            <m:sepChr m:val=""/>
+            <m:grow/>
+          </m:dPr>
+          <m:e>
+            <m:sSub>
+              <m:e>
+                <m:acc>
+                  <m:accPr>
+                    <m:chr m:val="̂"/>
+                  </m:accPr>
+                  <m:e>
+                    <m:r>
+                      <m:t>e</m:t>
+                    </m:r>
+                  </m:e>
+                </m:acc>
+              </m:e>
+              <m:sub>
+                <m:r>
+                  <m:t>t</m:t>
+                </m:r>
+              </m:sub>
+            </m:sSub>
+            <m:r>
+              <m:rPr>
+                <m:sty m:val="p"/>
+              </m:rPr>
+              <m:t>,</m:t>
+            </m:r>
+            <m:r>
+              <m:t>g</m:t>
+            </m:r>
+            <m:r>
+              <m:rPr>
+                <m:sty m:val="p"/>
+              </m:rPr>
+              <m:t>,</m:t>
+            </m:r>
+            <m:sSub>
+              <m:e>
+                <m:r>
+                  <m:t>b</m:t>
+                </m:r>
+              </m:e>
+              <m:sub>
+                <m:r>
+                  <m:t>t</m:t>
+                </m:r>
+              </m:sub>
+            </m:sSub>
+          </m:e>
+        </m:d>
+      </m:oMath>
+      <w:r>
+        <w:t xml:space="preserve"> </w:t>
+      </w:r>
+      <w:r>
+        <w:t xml:space="preserve">using the exposure summary, a confirmed reduce–retain–explore goal</w:t>
+      </w:r>
+      <w:r>
+        <w:t xml:space="preserve"> </w:t>
+      </w:r>
+      <m:oMath>
+        <m:r>
+          <m:t>g</m:t>
+        </m:r>
+      </m:oMath>
+      <w:r>
+        <w:t xml:space="preserve"> </w:t>
+      </w:r>
+      <w:r>
+        <w:t xml:space="preserve">and remaining budget</w:t>
+      </w:r>
+      <w:r>
+        <w:t xml:space="preserve"> </w:t>
+      </w:r>
+      <m:oMath>
+        <m:sSub>
+          <m:e>
+            <m:r>
+              <m:t>b</m:t>
+            </m:r>
+          </m:e>
+          <m:sub>
+            <m:r>
+              <m:t>t</m:t>
+            </m:r>
+          </m:sub>
+        </m:sSub>
+      </m:oMath>
+      <w:r>
+        <w:t xml:space="preserve">. Over horizon</w:t>
+      </w:r>
+      <w:r>
+        <w:t xml:space="preserve"> </w:t>
+      </w:r>
+      <m:oMath>
+        <m:r>
+          <m:t>T</m:t>
+        </m:r>
+      </m:oMath>
+      <w:r>
+        <w:t xml:space="preserve">, we compare permitted policies by</w:t>
+      </w:r>
+    </w:p>
+    <w:p>
+      <w:pPr>
+        <w:pStyle w:val="BodyText"/>
+        <w:keepNext/>
+        <w:widowControl/>
+      </w:pPr>
+      <m:oMathPara>
+        <m:oMathParaPr>
+          <m:jc m:val="center"/>
+        </m:oMathParaPr>
+        <m:oMath>
+          <m:limLow>
+            <m:e>
+              <m:r>
+                <m:rPr>
+                  <m:sty m:val="p"/>
+                </m:rPr>
+                <m:t>min</m:t>
+              </m:r>
+            </m:e>
+            <m:lim>
+              <m:r>
+                <m:t>π</m:t>
+              </m:r>
+              <m:r>
+                <m:rPr>
+                  <m:sty m:val="p"/>
+                </m:rPr>
+                <m:t>∈</m:t>
+              </m:r>
+              <m:sSub>
+                <m:e>
+                  <m:r>
+                    <m:t>Π</m:t>
+                  </m:r>
+                </m:e>
+                <m:sub>
+                  <m:r>
+                    <m:rPr>
+                      <m:sty m:val="p"/>
+                    </m:rPr>
+                    <m:t>u</m:t>
+                  </m:r>
+                  <m:r>
+                    <m:rPr>
+                      <m:sty m:val="p"/>
+                    </m:rPr>
+                    <m:t>s</m:t>
+                  </m:r>
+                  <m:r>
+                    <m:rPr>
+                      <m:sty m:val="p"/>
+                    </m:rPr>
+                    <m:t>e</m:t>
+                  </m:r>
+                  <m:r>
+                    <m:rPr>
+                      <m:sty m:val="p"/>
+                    </m:rPr>
+                    <m:t>r</m:t>
+                  </m:r>
+                </m:sub>
+              </m:sSub>
+            </m:lim>
+          </m:limLow>
+          <m:sSub>
+            <m:e>
+              <m:r>
+                <m:rPr>
+                  <m:sty m:val="p"/>
+                  <m:scr m:val="double-struck"/>
+                </m:rPr>
+                <m:t>E</m:t>
+              </m:r>
+            </m:e>
+            <m:sub>
+              <m:r>
+                <m:t>π</m:t>
+              </m:r>
+            </m:sub>
+          </m:sSub>
+          <m:r>
+            <m:t>​</m:t>
+          </m:r>
+          <m:d>
+            <m:dPr>
+              <m:begChr m:val="["/>
+              <m:endChr m:val="]"/>
+              <m:sepChr m:val=""/>
+              <m:grow/>
+            </m:dPr>
+            <m:e>
+              <m:nary>
+                <m:naryPr>
+                  <m:chr m:val="∑"/>
+                  <m:limLoc m:val="undOvr"/>
+                  <m:subHide m:val="off"/>
+                  <m:supHide m:val="off"/>
+                </m:naryPr>
+                <m:sub>
+                  <m:r>
+                    <m:t>t</m:t>
+                  </m:r>
+                  <m:r>
+                    <m:rPr>
+                      <m:sty m:val="p"/>
+                    </m:rPr>
+                    <m:t>=</m:t>
+                  </m:r>
+                  <m:r>
+                    <m:t>1</m:t>
+                  </m:r>
+                </m:sub>
+                <m:sup>
+                  <m:r>
+                    <m:t>T</m:t>
+                  </m:r>
+                </m:sup>
+                <m:e>
+                  <m:r>
+                    <m:rPr>
+                      <m:sty m:val="p"/>
+                    </m:rPr>
+                    <m:t>ℓ</m:t>
+                  </m:r>
+                </m:e>
+              </m:nary>
+              <m:d>
+                <m:dPr>
+                  <m:begChr m:val="("/>
+                  <m:endChr m:val=")"/>
+                  <m:sepChr m:val=""/>
+                  <m:grow/>
+                </m:dPr>
+                <m:e>
+                  <m:sSub>
+                    <m:e>
+                      <m:acc>
+                        <m:accPr>
+                          <m:chr m:val="̂"/>
+                        </m:accPr>
+                        <m:e>
+                          <m:r>
+                            <m:t>e</m:t>
+                          </m:r>
+                        </m:e>
+                      </m:acc>
+                    </m:e>
+                    <m:sub>
+                      <m:r>
+                        <m:t>t</m:t>
+                      </m:r>
+                    </m:sub>
+                  </m:sSub>
+                  <m:r>
+                    <m:rPr>
+                      <m:sty m:val="p"/>
+                    </m:rPr>
+                    <m:t>,</m:t>
+                  </m:r>
+                  <m:r>
+                    <m:t>g</m:t>
+                  </m:r>
+                </m:e>
+              </m:d>
+            </m:e>
+          </m:d>
+          <m:r>
+            <m:t> </m:t>
+          </m:r>
+          <m:r>
+            <m:rPr>
+              <m:sty m:val="p"/>
+            </m:rPr>
+            <m:t>s</m:t>
+          </m:r>
+          <m:r>
+            <m:rPr>
+              <m:sty m:val="p"/>
+            </m:rPr>
+            <m:t>.</m:t>
+          </m:r>
+          <m:r>
+            <m:rPr>
+              <m:sty m:val="p"/>
+            </m:rPr>
+            <m:t>t</m:t>
+          </m:r>
+          <m:r>
+            <m:rPr>
+              <m:sty m:val="p"/>
+            </m:rPr>
+            <m:t>.</m:t>
+          </m:r>
+          <m:r>
+            <m:t> </m:t>
+          </m:r>
+          <m:sSub>
+            <m:e>
+              <m:r>
+                <m:rPr>
+                  <m:sty m:val="p"/>
+                  <m:scr m:val="double-struck"/>
+                </m:rPr>
+                <m:t>E</m:t>
+              </m:r>
+            </m:e>
+            <m:sub>
+              <m:r>
+                <m:t>π</m:t>
+              </m:r>
+            </m:sub>
+          </m:sSub>
+          <m:d>
+            <m:dPr>
+              <m:begChr m:val="["/>
+              <m:endChr m:val="]"/>
+              <m:sepChr m:val=""/>
+              <m:grow/>
+            </m:dPr>
+            <m:e>
+              <m:sSub>
+                <m:e>
+                  <m:r>
+                    <m:t>C</m:t>
+                  </m:r>
+                </m:e>
+                <m:sub>
+                  <m:r>
+                    <m:t>T</m:t>
+                  </m:r>
+                </m:sub>
+              </m:sSub>
+            </m:e>
+          </m:d>
+          <m:r>
+            <m:rPr>
+              <m:sty m:val="p"/>
+            </m:rPr>
+            <m:t>≤</m:t>
+          </m:r>
+          <m:r>
+            <m:t>B</m:t>
+          </m:r>
+          <m:r>
+            <m:rPr>
+              <m:sty m:val="p"/>
+            </m:rPr>
+            <m:t>,</m:t>
+          </m:r>
+          <m:r>
+            <m:t> </m:t>
+          </m:r>
+          <m:sSub>
+            <m:e>
+              <m:r>
+                <m:rPr>
+                  <m:sty m:val="p"/>
+                  <m:scr m:val="double-struck"/>
+                </m:rPr>
+                <m:t>E</m:t>
+              </m:r>
+            </m:e>
+            <m:sub>
+              <m:r>
+                <m:t>π</m:t>
+              </m:r>
+            </m:sub>
+          </m:sSub>
+          <m:d>
+            <m:dPr>
+              <m:begChr m:val="["/>
+              <m:endChr m:val="]"/>
+              <m:sepChr m:val=""/>
+              <m:grow/>
+            </m:dPr>
+            <m:e>
+              <m:sSub>
+                <m:e>
+                  <m:r>
+                    <m:t>R</m:t>
+                  </m:r>
+                </m:e>
+                <m:sub>
+                  <m:r>
+                    <m:t>T</m:t>
+                  </m:r>
+                </m:sub>
+              </m:sSub>
+            </m:e>
+          </m:d>
+          <m:r>
+            <m:rPr>
+              <m:sty m:val="p"/>
+            </m:rPr>
+            <m:t>≥</m:t>
+          </m:r>
+          <m:r>
+            <m:t>ρ</m:t>
+          </m:r>
+          <m:r>
+            <m:rPr>
+              <m:sty m:val="p"/>
+            </m:rPr>
+            <m:t>.</m:t>
+          </m:r>
+        </m:oMath>
+      </m:oMathPara>
+    </w:p>
+    <w:p>
+      <w:pPr>
+        <w:pStyle w:val="FirstParagraph"/>
+        <w:widowControl/>
+      </w:pPr>
+      <m:oMath>
+        <m:sSub>
+          <m:e>
+            <m:r>
+              <m:t>Π</m:t>
+            </m:r>
+          </m:e>
+          <m:sub>
+            <m:r>
+              <m:rPr>
+                <m:sty m:val="p"/>
+              </m:rPr>
+              <m:t>u</m:t>
+            </m:r>
+            <m:r>
+              <m:rPr>
+                <m:sty m:val="p"/>
+              </m:rPr>
+              <m:t>s</m:t>
+            </m:r>
+            <m:r>
+              <m:rPr>
+                <m:sty m:val="p"/>
+              </m:rPr>
+              <m:t>e</m:t>
+            </m:r>
+            <m:r>
+              <m:rPr>
+                <m:sty m:val="p"/>
+              </m:rPr>
+              <m:t>r</m:t>
+            </m:r>
+          </m:sub>
+        </m:sSub>
+      </m:oMath>
+      <w:r>
+        <w:t xml:space="preserve"> </w:t>
+      </w:r>
+      <w:r>
+        <w:t xml:space="preserve">contains permitted policies and the expectation averages over random recommendations and responses. The loss</w:t>
+      </w:r>
+      <w:r>
+        <w:t xml:space="preserve"> </w:t>
+      </w:r>
+      <m:oMath>
+        <m:r>
+          <m:rPr>
+            <m:sty m:val="p"/>
+          </m:rPr>
+          <m:t>ℓ</m:t>
+        </m:r>
+      </m:oMath>
+      <w:r>
+        <w:t xml:space="preserve"> </w:t>
+      </w:r>
+      <w:r>
+        <w:t xml:space="preserve">measures goal mismatch;</w:t>
+      </w:r>
+      <w:r>
+        <w:t xml:space="preserve"> </w:t>
+      </w:r>
+      <m:oMath>
+        <m:sSub>
+          <m:e>
+            <m:r>
+              <m:t>C</m:t>
+            </m:r>
+          </m:e>
+          <m:sub>
+            <m:r>
+              <m:t>T</m:t>
+            </m:r>
+          </m:sub>
+        </m:sSub>
+      </m:oMath>
+      <w:r>
+        <w:t xml:space="preserve"> </w:t>
+      </w:r>
+      <w:r>
+        <w:t xml:space="preserve">is effort and</w:t>
+      </w:r>
+      <w:r>
+        <w:t xml:space="preserve"> </w:t>
+      </w:r>
+      <m:oMath>
+        <m:sSub>
+          <m:e>
+            <m:r>
+              <m:t>R</m:t>
+            </m:r>
+          </m:e>
+          <m:sub>
+            <m:r>
+              <m:t>T</m:t>
+            </m:r>
+          </m:sub>
+        </m:sSub>
+      </m:oMath>
+      <w:r>
+        <w:t xml:space="preserve"> </w:t>
+      </w:r>
+      <w:r>
+        <w:t xml:space="preserve">retention relative to no intervention. Budget</w:t>
+      </w:r>
+      <w:r>
+        <w:t xml:space="preserve"> </w:t>
+      </w:r>
+      <m:oMath>
+        <m:r>
+          <m:t>B</m:t>
+        </m:r>
+      </m:oMath>
+      <w:r>
+        <w:t xml:space="preserve">, minimum retention</w:t>
+      </w:r>
+      <w:r>
+        <w:t xml:space="preserve"> </w:t>
+      </w:r>
+      <m:oMath>
+        <m:r>
+          <m:t>ρ</m:t>
+        </m:r>
+      </m:oMath>
+      <w:r>
+        <w:t xml:space="preserve"> </w:t>
+      </w:r>
+      <w:r>
+        <w:t xml:space="preserve">and measurement rules are fixed by test scenarios or user confirmation. Unknown content and empty feeds cannot count as success. In the parenting example, loss tracks sweeping claims and retention tracks practical advice and distinct explanations. Additional reasons require documented sources.</w:t>
       </w:r>
     </w:p>
     <w:p>
@@ -539,18 +1601,18 @@
         <w:widowControl/>
       </w:pPr>
       <w:r>
-        <w:t xml:space="preserve">This analysis must distinguish content collections from personal exposure histories. We will produce individual time-based reports only where the logs contain enough relevant observations. Otherwise, we will report coverage limitations and use clearly identified constructed sequences to test the reporting method.</w:t>
+        <w:t xml:space="preserve">We will enumerate no-intervention, topic-filtering, negative-feedback, selective-filtering-plus-supplementation, and search/follow policies. Simulation estimates outcomes; infeasible candidates are excluded. If none qualifies, we report no feasible option. Given these estimates, selection is linear in candidate count. Platform actions and external-tool functions remain distinct. We do not claim global optimality.</w:t>
       </w:r>
     </w:p>
     <w:bookmarkEnd w:id="22"/>
-    <w:bookmarkStart w:id="23" w:name="compare-adjustments"/>
+    <w:bookmarkStart w:id="23" w:name="X7c4955de59ee35115204917af57a512f46c4580"/>
     <w:p>
       <w:pPr>
         <w:pStyle w:val="Heading2"/>
         <w:widowControl/>
       </w:pPr>
       <w:r>
-        <w:t xml:space="preserve">Compare adjustments</w:t>
+        <w:t xml:space="preserve">Simulation: testing the recommendation–feedback loop</w:t>
       </w:r>
     </w:p>
     <w:p>
@@ -559,7 +1621,460 @@
         <w:widowControl/>
       </w:pPr>
       <w:r>
-        <w:t xml:space="preserve">The input to the control step is a user-confirmed description of what to reduce, retain and add, together with permitted actions. We will compare no intervention, broad topic filtering, targeted negative feedback, selective filtering with sourced supplementary material, and directed searching or following. We will distinguish platform controls from filtering and supplementation provided by a proposed external tool.</w:t>
+        <w:t xml:space="preserve">Let</w:t>
+      </w:r>
+      <w:r>
+        <w:t xml:space="preserve"> </w:t>
+      </w:r>
+      <m:oMath>
+        <m:sSub>
+          <m:e>
+            <m:r>
+              <m:t>s</m:t>
+            </m:r>
+          </m:e>
+          <m:sub>
+            <m:r>
+              <m:t>t</m:t>
+            </m:r>
+          </m:sub>
+        </m:sSub>
+      </m:oMath>
+      <w:r>
+        <w:t xml:space="preserve"> </w:t>
+      </w:r>
+      <w:r>
+        <w:t xml:space="preserve">contain recommendation history and user behavioural state. At step</w:t>
+      </w:r>
+      <w:r>
+        <w:t xml:space="preserve"> </w:t>
+      </w:r>
+      <m:oMath>
+        <m:r>
+          <m:t>t</m:t>
+        </m:r>
+      </m:oMath>
+      <w:r>
+        <w:t xml:space="preserve">, the recommender</w:t>
+      </w:r>
+      <w:r>
+        <w:t xml:space="preserve"> </w:t>
+      </w:r>
+      <m:oMath>
+        <m:r>
+          <m:rPr>
+            <m:sty m:val="p"/>
+            <m:scr m:val="script"/>
+          </m:rPr>
+          <m:t>R</m:t>
+        </m:r>
+      </m:oMath>
+      <w:r>
+        <w:t xml:space="preserve"> </w:t>
+      </w:r>
+      <w:r>
+        <w:t xml:space="preserve">generates exposure</w:t>
+      </w:r>
+      <w:r>
+        <w:t xml:space="preserve"> </w:t>
+      </w:r>
+      <m:oMath>
+        <m:sSub>
+          <m:e>
+            <m:r>
+              <m:t>x</m:t>
+            </m:r>
+          </m:e>
+          <m:sub>
+            <m:r>
+              <m:t>t</m:t>
+            </m:r>
+          </m:sub>
+        </m:sSub>
+      </m:oMath>
+      <w:r>
+        <w:t xml:space="preserve">, the user model</w:t>
+      </w:r>
+      <w:r>
+        <w:t xml:space="preserve"> </w:t>
+      </w:r>
+      <m:oMath>
+        <m:r>
+          <m:rPr>
+            <m:sty m:val="p"/>
+            <m:scr m:val="script"/>
+          </m:rPr>
+          <m:t>U</m:t>
+        </m:r>
+      </m:oMath>
+      <w:r>
+        <w:t xml:space="preserve"> </w:t>
+      </w:r>
+      <w:r>
+        <w:t xml:space="preserve">generates feedback</w:t>
+      </w:r>
+      <w:r>
+        <w:t xml:space="preserve"> </w:t>
+      </w:r>
+      <m:oMath>
+        <m:sSub>
+          <m:e>
+            <m:r>
+              <m:t>y</m:t>
+            </m:r>
+          </m:e>
+          <m:sub>
+            <m:r>
+              <m:t>t</m:t>
+            </m:r>
+          </m:sub>
+        </m:sSub>
+      </m:oMath>
+      <w:r>
+        <w:t xml:space="preserve">, and the selected action</w:t>
+      </w:r>
+      <w:r>
+        <w:t xml:space="preserve"> </w:t>
+      </w:r>
+      <m:oMath>
+        <m:sSub>
+          <m:e>
+            <m:r>
+              <m:t>a</m:t>
+            </m:r>
+          </m:e>
+          <m:sub>
+            <m:r>
+              <m:t>t</m:t>
+            </m:r>
+          </m:sub>
+        </m:sSub>
+      </m:oMath>
+      <w:r>
+        <w:t xml:space="preserve"> </w:t>
+      </w:r>
+      <w:r>
+        <w:t xml:space="preserve">enters the state-update rule</w:t>
+      </w:r>
+      <w:r>
+        <w:t xml:space="preserve"> </w:t>
+      </w:r>
+      <m:oMath>
+        <m:r>
+          <m:rPr>
+            <m:sty m:val="p"/>
+            <m:scr m:val="script"/>
+          </m:rPr>
+          <m:t>F</m:t>
+        </m:r>
+      </m:oMath>
+      <w:r>
+        <w:t xml:space="preserve">:</w:t>
+      </w:r>
+    </w:p>
+    <w:p>
+      <w:pPr>
+        <w:pStyle w:val="BodyText"/>
+        <w:keepNext/>
+        <w:widowControl/>
+      </w:pPr>
+      <m:oMathPara>
+        <m:oMathParaPr>
+          <m:jc m:val="center"/>
+        </m:oMathParaPr>
+        <m:oMath>
+          <m:sSub>
+            <m:e>
+              <m:r>
+                <m:t>x</m:t>
+              </m:r>
+            </m:e>
+            <m:sub>
+              <m:r>
+                <m:t>t</m:t>
+              </m:r>
+            </m:sub>
+          </m:sSub>
+          <m:r>
+            <m:rPr>
+              <m:sty m:val="p"/>
+            </m:rPr>
+            <m:t>∼</m:t>
+          </m:r>
+          <m:r>
+            <m:rPr>
+              <m:sty m:val="p"/>
+              <m:scr m:val="script"/>
+            </m:rPr>
+            <m:t>R</m:t>
+          </m:r>
+          <m:d>
+            <m:dPr>
+              <m:begChr m:val="("/>
+              <m:endChr m:val=")"/>
+              <m:sepChr m:val=""/>
+              <m:grow/>
+            </m:dPr>
+            <m:e>
+              <m:r>
+                <m:rPr>
+                  <m:sty m:val="p"/>
+                </m:rPr>
+                <m:t>⋅</m:t>
+              </m:r>
+              <m:r>
+                <m:rPr>
+                  <m:sty m:val="p"/>
+                </m:rPr>
+                <m:t>∣</m:t>
+              </m:r>
+              <m:sSub>
+                <m:e>
+                  <m:r>
+                    <m:t>s</m:t>
+                  </m:r>
+                </m:e>
+                <m:sub>
+                  <m:r>
+                    <m:t>t</m:t>
+                  </m:r>
+                </m:sub>
+              </m:sSub>
+            </m:e>
+          </m:d>
+          <m:r>
+            <m:rPr>
+              <m:sty m:val="p"/>
+            </m:rPr>
+            <m:t>,</m:t>
+          </m:r>
+          <m:r>
+            <m:t> </m:t>
+          </m:r>
+          <m:sSub>
+            <m:e>
+              <m:r>
+                <m:t>y</m:t>
+              </m:r>
+            </m:e>
+            <m:sub>
+              <m:r>
+                <m:t>t</m:t>
+              </m:r>
+            </m:sub>
+          </m:sSub>
+          <m:r>
+            <m:rPr>
+              <m:sty m:val="p"/>
+            </m:rPr>
+            <m:t>∼</m:t>
+          </m:r>
+          <m:r>
+            <m:rPr>
+              <m:sty m:val="p"/>
+              <m:scr m:val="script"/>
+            </m:rPr>
+            <m:t>U</m:t>
+          </m:r>
+          <m:d>
+            <m:dPr>
+              <m:begChr m:val="("/>
+              <m:endChr m:val=")"/>
+              <m:sepChr m:val=""/>
+              <m:grow/>
+            </m:dPr>
+            <m:e>
+              <m:r>
+                <m:rPr>
+                  <m:sty m:val="p"/>
+                </m:rPr>
+                <m:t>⋅</m:t>
+              </m:r>
+              <m:r>
+                <m:rPr>
+                  <m:sty m:val="p"/>
+                </m:rPr>
+                <m:t>∣</m:t>
+              </m:r>
+              <m:sSub>
+                <m:e>
+                  <m:r>
+                    <m:t>x</m:t>
+                  </m:r>
+                </m:e>
+                <m:sub>
+                  <m:r>
+                    <m:t>t</m:t>
+                  </m:r>
+                </m:sub>
+              </m:sSub>
+              <m:r>
+                <m:rPr>
+                  <m:sty m:val="p"/>
+                </m:rPr>
+                <m:t>,</m:t>
+              </m:r>
+              <m:sSub>
+                <m:e>
+                  <m:r>
+                    <m:t>s</m:t>
+                  </m:r>
+                </m:e>
+                <m:sub>
+                  <m:r>
+                    <m:t>t</m:t>
+                  </m:r>
+                </m:sub>
+              </m:sSub>
+            </m:e>
+          </m:d>
+          <m:r>
+            <m:rPr>
+              <m:sty m:val="p"/>
+            </m:rPr>
+            <m:t>,</m:t>
+          </m:r>
+          <m:r>
+            <m:t> </m:t>
+          </m:r>
+          <m:sSub>
+            <m:e>
+              <m:r>
+                <m:t>s</m:t>
+              </m:r>
+            </m:e>
+            <m:sub>
+              <m:r>
+                <m:t>t</m:t>
+              </m:r>
+              <m:r>
+                <m:rPr>
+                  <m:sty m:val="p"/>
+                </m:rPr>
+                <m:t>+</m:t>
+              </m:r>
+              <m:r>
+                <m:t>1</m:t>
+              </m:r>
+            </m:sub>
+          </m:sSub>
+          <m:r>
+            <m:rPr>
+              <m:sty m:val="p"/>
+            </m:rPr>
+            <m:t>∼</m:t>
+          </m:r>
+          <m:r>
+            <m:rPr>
+              <m:sty m:val="p"/>
+              <m:scr m:val="script"/>
+            </m:rPr>
+            <m:t>F</m:t>
+          </m:r>
+          <m:d>
+            <m:dPr>
+              <m:begChr m:val="("/>
+              <m:endChr m:val=")"/>
+              <m:sepChr m:val=""/>
+              <m:grow/>
+            </m:dPr>
+            <m:e>
+              <m:r>
+                <m:rPr>
+                  <m:sty m:val="p"/>
+                </m:rPr>
+                <m:t>⋅</m:t>
+              </m:r>
+              <m:r>
+                <m:rPr>
+                  <m:sty m:val="p"/>
+                </m:rPr>
+                <m:t>∣</m:t>
+              </m:r>
+              <m:sSub>
+                <m:e>
+                  <m:r>
+                    <m:t>s</m:t>
+                  </m:r>
+                </m:e>
+                <m:sub>
+                  <m:r>
+                    <m:t>t</m:t>
+                  </m:r>
+                </m:sub>
+              </m:sSub>
+              <m:r>
+                <m:rPr>
+                  <m:sty m:val="p"/>
+                </m:rPr>
+                <m:t>,</m:t>
+              </m:r>
+              <m:sSub>
+                <m:e>
+                  <m:r>
+                    <m:t>x</m:t>
+                  </m:r>
+                </m:e>
+                <m:sub>
+                  <m:r>
+                    <m:t>t</m:t>
+                  </m:r>
+                </m:sub>
+              </m:sSub>
+              <m:r>
+                <m:rPr>
+                  <m:sty m:val="p"/>
+                </m:rPr>
+                <m:t>,</m:t>
+              </m:r>
+              <m:sSub>
+                <m:e>
+                  <m:r>
+                    <m:t>y</m:t>
+                  </m:r>
+                </m:e>
+                <m:sub>
+                  <m:r>
+                    <m:t>t</m:t>
+                  </m:r>
+                </m:sub>
+              </m:sSub>
+              <m:r>
+                <m:rPr>
+                  <m:sty m:val="p"/>
+                </m:rPr>
+                <m:t>,</m:t>
+              </m:r>
+              <m:sSub>
+                <m:e>
+                  <m:r>
+                    <m:t>a</m:t>
+                  </m:r>
+                </m:e>
+                <m:sub>
+                  <m:r>
+                    <m:t>t</m:t>
+                  </m:r>
+                </m:sub>
+              </m:sSub>
+            </m:e>
+          </m:d>
+          <m:r>
+            <m:rPr>
+              <m:sty m:val="p"/>
+            </m:rPr>
+            <m:t>.</m:t>
+          </m:r>
+        </m:oMath>
+      </m:oMathPara>
+    </w:p>
+    <w:p>
+      <w:pPr>
+        <w:pStyle w:val="FirstParagraph"/>
+        <w:widowControl/>
+      </w:pPr>
+      <w:r>
+        <w:t xml:space="preserve">This simulation separates viewing tendencies from adjustment goals. Rule-based, data-driven, LLM-based and hybrid users will be compared against available held-out logs, including probability calibration. Recommendation memory, exploration and feedback strength will vary across experiments. Watching upsetting videos can conflict with wanting fewer recommendations of them. Each policy receives only observable records, not hidden preferences or recommender parameters.</w:t>
       </w:r>
     </w:p>
     <w:p>
@@ -568,50 +2083,12 @@
         <w:widowControl/>
       </w:pPr>
       <w:r>
-        <w:t xml:space="preserve">A simple constrained selection procedure will reject strategies that remove too much desired information, then compare the remaining options by unwanted exposure, information retained, additional reasons found and effort required. Semantic similarity can help retrieve material, but will not by itself establish whether it adds a different reason. An LLM assistant may clarify requests and call search or analysis tools; the calculations and constraints will remain independently checkable.</w:t>
+        <w:t xml:space="preserve">Matched initial states and repeated random seeds will compare goal attainment, information loss, effort and recurrence. Continued intervention, stopping it and resuming earlier viewing will be tested separately. We will report averages, variation across runs and constraint-violation frequency. Sensitivity to model parameters and label errors will test robustness; simulated effects are not evidence of live-platform effects.</w:t>
       </w:r>
     </w:p>
     <w:bookmarkEnd w:id="23"/>
-    <w:bookmarkStart w:id="24" w:name="test-the-feedback-loop"/>
-    <w:p>
-      <w:pPr>
-        <w:pStyle w:val="Heading2"/>
-        <w:widowControl/>
-      </w:pPr>
-      <w:r>
-        <w:t xml:space="preserve">Test the feedback loop</w:t>
-      </w:r>
-    </w:p>
-    <w:p>
-      <w:pPr>
-        <w:pStyle w:val="FirstParagraph"/>
-        <w:widowControl/>
-      </w:pPr>
-      <w:r>
-        <w:t xml:space="preserve">The simulation will separate the content pool, recommender, user and intervention strategy. At each step, the recommender selects content, the user responds, the platform updates its history, and the next recommendation is produced. The user’s tendency to watch something will be represented separately from their stated adjustment goal.</w:t>
-      </w:r>
-    </w:p>
-    <w:p>
-      <w:pPr>
-        <w:pStyle w:val="BodyText"/>
-        <w:widowControl/>
-      </w:pPr>
-      <w:r>
-        <w:t xml:space="preserve">We will compare a transparent rule-based user with data-driven and LLM-based candidates. A promising option combines semantic interpretation with a statistical model of observable behaviour. Where matching content and logs exist, predicted behaviour must be checked against held-out records; plausible explanations alone do not establish realism. The study will retain a simple simulation if more elaborate users cannot be justified.</w:t>
-      </w:r>
-    </w:p>
-    <w:p>
-      <w:pPr>
-        <w:pStyle w:val="BodyText"/>
-        <w:widowControl/>
-      </w:pPr>
-      <w:r>
-        <w:t xml:space="preserve">Experiments will compare continued intervention with stopping it, under different assumptions about recommendation memory, exploration and responses to negative feedback. Outputs will include whether a goal is reached, exposure steps required, useful information lost, actions taken and whether the unwanted pattern returns. Repeated runs will test sensitivity to model assumptions; the simulator does not reproduce a live platform.</w:t>
-      </w:r>
-    </w:p>
     <w:bookmarkEnd w:id="24"/>
-    <w:bookmarkEnd w:id="25"/>
-    <w:bookmarkStart w:id="26" w:name="related-work-and-research-focus"/>
+    <w:bookmarkStart w:id="25" w:name="related-work-and-research-focus"/>
     <w:p>
       <w:pPr>
         <w:pStyle w:val="Heading1"/>
@@ -877,8 +2354,8 @@
         <w:t xml:space="preserve">Our contribution is to investigate this question across several issues under imperfect content understanding and limited platform access, rather than invent a new recommendation algorithm.</w:t>
       </w:r>
     </w:p>
-    <w:bookmarkEnd w:id="26"/>
-    <w:bookmarkStart w:id="27" w:name="feasibility-limitations-and-ethics"/>
+    <w:bookmarkEnd w:id="25"/>
+    <w:bookmarkStart w:id="26" w:name="feasibility-limitations-and-ethics"/>
     <w:p>
       <w:pPr>
         <w:pStyle w:val="Heading1"/>
@@ -894,7 +2371,7 @@
         <w:widowControl/>
       </w:pPr>
       <w:r>
-        <w:t xml:space="preserve">We have obtained public short-video content and interaction datasets, checked video–transcript pairs, and run initial retrieval and response-model checks. These establish access and basic execution, not classification quality or realistic simulation.</w:t>
+        <w:t xml:space="preserve">We have obtained public short-video content and interaction datasets, checked video–transcript pairs, and run initial retrieval and response-model checks. These establish access and execution, not accuracy or simulation realism.</w:t>
       </w:r>
     </w:p>
     <w:p>
@@ -912,7 +2389,7 @@
         <w:widowControl/>
       </w:pPr>
       <w:r>
-        <w:t xml:space="preserve">The main limitations are incomplete video context, sparse personal histories and unknown platform responses. Observational changes after negative feedback will be reported as associations, not causal effects. Simulation results will remain conditional on their assumptions. Broader exposure does not prove better judgement, and removing disliked views can itself narrow a feed. We will make those trade-offs visible and avoid treating opposing claims as equally credible when their evidence differs.</w:t>
+        <w:t xml:space="preserve">The main limitations are incomplete video context, sparse personal histories and unknown platform responses. Observational changes after negative feedback will be reported as associations, not causal effects. Simulation results will remain conditional on their assumptions. Independently checked labels will be used where available to assess whether measurement errors make an intervention look better than it is. Broader exposure does not prove better judgement, and removing disliked views can itself narrow a feed. We will make those trade-offs visible and avoid treating opposing claims as equally credible when their evidence differs.</w:t>
       </w:r>
     </w:p>
     <w:p>
@@ -924,8 +2401,8 @@
         <w:t xml:space="preserve">The core work uses publicly released research data and simulated users. Offline adjustment goals will be specified as test scenarios, not inferred as the wishes of people in anonymous logs. We will follow dataset terms, avoid identifying individuals, and keep unnecessary personal details out of examples and shared outputs. Any external AI processing must respect the source’s permitted use and avoid sending identifiable histories. Human testing is optional; before recruitment, we would confirm applicable course or university requirements and obtain informed consent. No live account automation or platform intervention is needed for the core study.</w:t>
       </w:r>
     </w:p>
-    <w:bookmarkEnd w:id="27"/>
-    <w:bookmarkStart w:id="28" w:name="timeline-and-responsibilities"/>
+    <w:bookmarkEnd w:id="26"/>
+    <w:bookmarkStart w:id="27" w:name="timeline-and-responsibilities"/>
     <w:p>
       <w:pPr>
         <w:pStyle w:val="Heading1"/>
@@ -1771,8 +3248,8 @@
         <w:t xml:space="preserve">Fu Yitong and Wang Junbo will independently annotate the evaluation sample using a protocol developed with Zhao Dingcheng; disagreements will be reviewed together. Each member will write a substantive section and review another’s work. Weekly meetings will track evidence, dependencies and progress.</w:t>
       </w:r>
     </w:p>
-    <w:bookmarkEnd w:id="28"/>
-    <w:bookmarkStart w:id="49" w:name="references"/>
+    <w:bookmarkEnd w:id="27"/>
+    <w:bookmarkStart w:id="48" w:name="references"/>
     <w:p>
       <w:pPr>
         <w:pStyle w:val="Heading1"/>
@@ -1790,14 +3267,14 @@
         <w:spacing w:after="100" w:line="252" w:lineRule="auto"/>
         <w:ind w:left="400" w:hanging="400"/>
       </w:pPr>
-      <w:bookmarkStart w:id="29" w:name="ref-1"/>
+      <w:bookmarkStart w:id="28" w:name="ref-1"/>
       <w:r>
         <w:rPr>
           <w:sz w:val="19"/>
         </w:rPr>
         <w:t xml:space="preserve">[1]</w:t>
       </w:r>
-      <w:bookmarkEnd w:id="29"/>
+      <w:bookmarkEnd w:id="28"/>
       <w:r>
         <w:rPr>
           <w:sz w:val="19"/>
@@ -1816,7 +3293,7 @@
         </w:rPr>
         <w:t xml:space="preserve"> </w:t>
       </w:r>
-      <w:hyperlink r:id="rId30">
+      <w:hyperlink r:id="rId29">
         <w:r>
           <w:rPr>
             <w:rStyle w:val="Hyperlink"/>
@@ -1842,14 +3319,14 @@
         <w:spacing w:after="100" w:line="252" w:lineRule="auto"/>
         <w:ind w:left="400" w:hanging="400"/>
       </w:pPr>
-      <w:bookmarkStart w:id="31" w:name="ref-2"/>
+      <w:bookmarkStart w:id="30" w:name="ref-2"/>
       <w:r>
         <w:rPr>
           <w:sz w:val="19"/>
         </w:rPr>
         <w:t xml:space="preserve">[2]</w:t>
       </w:r>
-      <w:bookmarkEnd w:id="31"/>
+      <w:bookmarkEnd w:id="30"/>
       <w:r>
         <w:rPr>
           <w:sz w:val="19"/>
@@ -1868,7 +3345,7 @@
         </w:rPr>
         <w:t xml:space="preserve"> </w:t>
       </w:r>
-      <w:hyperlink r:id="rId32">
+      <w:hyperlink r:id="rId31">
         <w:r>
           <w:rPr>
             <w:rStyle w:val="Hyperlink"/>
@@ -1921,14 +3398,14 @@
         <w:spacing w:after="100" w:line="252" w:lineRule="auto"/>
         <w:ind w:left="400" w:hanging="400"/>
       </w:pPr>
-      <w:bookmarkStart w:id="33" w:name="ref-3"/>
+      <w:bookmarkStart w:id="32" w:name="ref-3"/>
       <w:r>
         <w:rPr>
           <w:sz w:val="19"/>
         </w:rPr>
         <w:t xml:space="preserve">[3]</w:t>
       </w:r>
-      <w:bookmarkEnd w:id="33"/>
+      <w:bookmarkEnd w:id="32"/>
       <w:r>
         <w:rPr>
           <w:sz w:val="19"/>
@@ -1947,7 +3424,7 @@
         </w:rPr>
         <w:t xml:space="preserve"> </w:t>
       </w:r>
-      <w:hyperlink r:id="rId34">
+      <w:hyperlink r:id="rId33">
         <w:r>
           <w:rPr>
             <w:rStyle w:val="Hyperlink"/>
@@ -1973,14 +3450,14 @@
         <w:spacing w:after="100" w:line="252" w:lineRule="auto"/>
         <w:ind w:left="400" w:hanging="400"/>
       </w:pPr>
-      <w:bookmarkStart w:id="35" w:name="ref-4"/>
+      <w:bookmarkStart w:id="34" w:name="ref-4"/>
       <w:r>
         <w:rPr>
           <w:sz w:val="19"/>
         </w:rPr>
         <w:t xml:space="preserve">[4]</w:t>
       </w:r>
-      <w:bookmarkEnd w:id="35"/>
+      <w:bookmarkEnd w:id="34"/>
       <w:r>
         <w:rPr>
           <w:sz w:val="19"/>
@@ -1999,7 +3476,7 @@
         </w:rPr>
         <w:t xml:space="preserve"> </w:t>
       </w:r>
-      <w:hyperlink r:id="rId36">
+      <w:hyperlink r:id="rId35">
         <w:r>
           <w:rPr>
             <w:rStyle w:val="Hyperlink"/>
@@ -2022,7 +3499,7 @@
         </w:rPr>
         <w:t xml:space="preserve"> </w:t>
       </w:r>
-      <w:hyperlink r:id="rId36">
+      <w:hyperlink r:id="rId35">
         <w:r>
           <w:rPr>
             <w:rStyle w:val="Hyperlink"/>
@@ -2046,14 +3523,14 @@
         <w:spacing w:after="100" w:line="252" w:lineRule="auto"/>
         <w:ind w:left="400" w:hanging="400"/>
       </w:pPr>
-      <w:bookmarkStart w:id="37" w:name="ref-5"/>
+      <w:bookmarkStart w:id="36" w:name="ref-5"/>
       <w:r>
         <w:rPr>
           <w:sz w:val="19"/>
         </w:rPr>
         <w:t xml:space="preserve">[5]</w:t>
       </w:r>
-      <w:bookmarkEnd w:id="37"/>
+      <w:bookmarkEnd w:id="36"/>
       <w:r>
         <w:rPr>
           <w:sz w:val="19"/>
@@ -2072,7 +3549,7 @@
         </w:rPr>
         <w:t xml:space="preserve"> </w:t>
       </w:r>
-      <w:hyperlink r:id="rId38">
+      <w:hyperlink r:id="rId37">
         <w:r>
           <w:rPr>
             <w:rStyle w:val="Hyperlink"/>
@@ -2095,7 +3572,7 @@
         </w:rPr>
         <w:t xml:space="preserve"> </w:t>
       </w:r>
-      <w:hyperlink r:id="rId38">
+      <w:hyperlink r:id="rId37">
         <w:r>
           <w:rPr>
             <w:rStyle w:val="Hyperlink"/>
@@ -2119,14 +3596,14 @@
         <w:spacing w:after="100" w:line="252" w:lineRule="auto"/>
         <w:ind w:left="400" w:hanging="400"/>
       </w:pPr>
-      <w:bookmarkStart w:id="39" w:name="ref-6"/>
+      <w:bookmarkStart w:id="38" w:name="ref-6"/>
       <w:r>
         <w:rPr>
           <w:sz w:val="19"/>
         </w:rPr>
         <w:t xml:space="preserve">[6]</w:t>
       </w:r>
-      <w:bookmarkEnd w:id="39"/>
+      <w:bookmarkEnd w:id="38"/>
       <w:r>
         <w:rPr>
           <w:sz w:val="19"/>
@@ -2145,7 +3622,7 @@
         </w:rPr>
         <w:t xml:space="preserve"> </w:t>
       </w:r>
-      <w:hyperlink r:id="rId40">
+      <w:hyperlink r:id="rId39">
         <w:r>
           <w:rPr>
             <w:rStyle w:val="Hyperlink"/>
@@ -2177,14 +3654,14 @@
         <w:spacing w:after="100" w:line="252" w:lineRule="auto"/>
         <w:ind w:left="400" w:hanging="400"/>
       </w:pPr>
-      <w:bookmarkStart w:id="41" w:name="ref-7"/>
+      <w:bookmarkStart w:id="40" w:name="ref-7"/>
       <w:r>
         <w:rPr>
           <w:sz w:val="19"/>
         </w:rPr>
         <w:t xml:space="preserve">[7]</w:t>
       </w:r>
-      <w:bookmarkEnd w:id="41"/>
+      <w:bookmarkEnd w:id="40"/>
       <w:r>
         <w:rPr>
           <w:sz w:val="19"/>
@@ -2203,7 +3680,7 @@
         </w:rPr>
         <w:t xml:space="preserve"> </w:t>
       </w:r>
-      <w:hyperlink r:id="rId42">
+      <w:hyperlink r:id="rId41">
         <w:r>
           <w:rPr>
             <w:rStyle w:val="Hyperlink"/>
@@ -2229,14 +3706,14 @@
         <w:spacing w:after="100" w:line="252" w:lineRule="auto"/>
         <w:ind w:left="400" w:hanging="400"/>
       </w:pPr>
-      <w:bookmarkStart w:id="43" w:name="ref-8"/>
+      <w:bookmarkStart w:id="42" w:name="ref-8"/>
       <w:r>
         <w:rPr>
           <w:sz w:val="19"/>
         </w:rPr>
         <w:t xml:space="preserve">[8]</w:t>
       </w:r>
-      <w:bookmarkEnd w:id="43"/>
+      <w:bookmarkEnd w:id="42"/>
       <w:r>
         <w:rPr>
           <w:sz w:val="19"/>
@@ -2255,7 +3732,7 @@
         </w:rPr>
         <w:t xml:space="preserve"> </w:t>
       </w:r>
-      <w:hyperlink r:id="rId44">
+      <w:hyperlink r:id="rId43">
         <w:r>
           <w:rPr>
             <w:rStyle w:val="Hyperlink"/>
@@ -2278,7 +3755,7 @@
         </w:rPr>
         <w:t xml:space="preserve"> </w:t>
       </w:r>
-      <w:hyperlink r:id="rId44">
+      <w:hyperlink r:id="rId43">
         <w:r>
           <w:rPr>
             <w:rStyle w:val="Hyperlink"/>
@@ -2302,14 +3779,14 @@
         <w:spacing w:after="100" w:line="252" w:lineRule="auto"/>
         <w:ind w:left="400" w:hanging="400"/>
       </w:pPr>
-      <w:bookmarkStart w:id="45" w:name="ref-9"/>
+      <w:bookmarkStart w:id="44" w:name="ref-9"/>
       <w:r>
         <w:rPr>
           <w:sz w:val="19"/>
         </w:rPr>
         <w:t xml:space="preserve">[9]</w:t>
       </w:r>
-      <w:bookmarkEnd w:id="45"/>
+      <w:bookmarkEnd w:id="44"/>
       <w:r>
         <w:rPr>
           <w:sz w:val="19"/>
@@ -2328,7 +3805,7 @@
         </w:rPr>
         <w:t xml:space="preserve"> </w:t>
       </w:r>
-      <w:hyperlink r:id="rId46">
+      <w:hyperlink r:id="rId45">
         <w:r>
           <w:rPr>
             <w:rStyle w:val="Hyperlink"/>
@@ -2354,14 +3831,14 @@
         <w:spacing w:after="100" w:line="252" w:lineRule="auto"/>
         <w:ind w:left="400" w:hanging="400"/>
       </w:pPr>
-      <w:bookmarkStart w:id="47" w:name="ref-10"/>
+      <w:bookmarkStart w:id="46" w:name="ref-10"/>
       <w:r>
         <w:rPr>
           <w:sz w:val="19"/>
         </w:rPr>
         <w:t xml:space="preserve">[10]</w:t>
       </w:r>
-      <w:bookmarkEnd w:id="47"/>
+      <w:bookmarkEnd w:id="46"/>
       <w:r>
         <w:rPr>
           <w:sz w:val="19"/>
@@ -2380,7 +3857,7 @@
         </w:rPr>
         <w:t xml:space="preserve"> </w:t>
       </w:r>
-      <w:hyperlink r:id="rId48">
+      <w:hyperlink r:id="rId47">
         <w:r>
           <w:rPr>
             <w:rStyle w:val="Hyperlink"/>
@@ -2398,8 +3875,8 @@
         <w:t xml:space="preserve">. NAACL 2024, pp. 1490–1504.</w:t>
       </w:r>
     </w:p>
+    <w:bookmarkEnd w:id="48"/>
     <w:bookmarkEnd w:id="49"/>
-    <w:bookmarkEnd w:id="50"/>
     <w:sectPr>
       <w:headerReference w:type="default" r:id="rId9"/>
       <w:footerReference w:type="default" r:id="rId10"/>

</xml_diff>

<commit_message>
Align intervention objective with subsequent exposure and horizon
</commit_message>
<xml_diff>
--- a/docs/project-plan/submission/Project_Plan_EN.docx
+++ b/docs/project-plan/submission/Project_Plan_EN.docx
@@ -995,7 +995,7 @@
         <w:widowControl/>
       </w:pPr>
       <w:r>
-        <w:t xml:space="preserve">Independent double annotation, precision/recall, modality comparisons and a held-out issue will test measurement quality; sparse histories will remain unscored. Disagreements and alternative plausible labels for uncertain items will test whether classification errors change the conclusions.</w:t>
+        <w:t xml:space="preserve">Double annotation, precision/recall, modality comparisons and a held-out issue will test measurement quality; sparse histories remain unscored. Alternative plausible labels will test sensitivity to classification errors.</w:t>
       </w:r>
     </w:p>
     <w:bookmarkEnd w:id="21"/>
@@ -1015,7 +1015,41 @@
         <w:widowControl/>
       </w:pPr>
       <w:r>
-        <w:t xml:space="preserve">An action-selection policy chooses</w:t>
+        <w:t xml:space="preserve">Given the summary, confirmed reduce–retain–explore goal</w:t>
+      </w:r>
+      <w:r>
+        <w:t xml:space="preserve"> </w:t>
+      </w:r>
+      <m:oMath>
+        <m:r>
+          <m:t>g</m:t>
+        </m:r>
+      </m:oMath>
+      <w:r>
+        <w:t xml:space="preserve"> </w:t>
+      </w:r>
+      <w:r>
+        <w:t xml:space="preserve">and remaining budget</w:t>
+      </w:r>
+      <w:r>
+        <w:t xml:space="preserve"> </w:t>
+      </w:r>
+      <m:oMath>
+        <m:sSub>
+          <m:e>
+            <m:r>
+              <m:t>b</m:t>
+            </m:r>
+          </m:e>
+          <m:sub>
+            <m:r>
+              <m:t>t</m:t>
+            </m:r>
+          </m:sub>
+        </m:sSub>
+      </m:oMath>
+      <w:r>
+        <w:t xml:space="preserve">, a policy chooses</w:t>
       </w:r>
       <w:r>
         <w:t xml:space="preserve"> </w:t>
@@ -1100,24 +1134,7 @@
         </m:d>
       </m:oMath>
       <w:r>
-        <w:t xml:space="preserve"> </w:t>
-      </w:r>
-      <w:r>
-        <w:t xml:space="preserve">using the exposure summary, a confirmed reduce–retain–explore goal</w:t>
-      </w:r>
-      <w:r>
-        <w:t xml:space="preserve"> </w:t>
-      </w:r>
-      <m:oMath>
-        <m:r>
-          <m:t>g</m:t>
-        </m:r>
-      </m:oMath>
-      <w:r>
-        <w:t xml:space="preserve"> </w:t>
-      </w:r>
-      <w:r>
-        <w:t xml:space="preserve">and remaining budget</w:t>
+        <w:t xml:space="preserve">. From observed</w:t>
       </w:r>
       <w:r>
         <w:t xml:space="preserve"> </w:t>
@@ -1125,19 +1142,26 @@
       <m:oMath>
         <m:sSub>
           <m:e>
-            <m:r>
-              <m:t>b</m:t>
-            </m:r>
+            <m:acc>
+              <m:accPr>
+                <m:chr m:val="̂"/>
+              </m:accPr>
+              <m:e>
+                <m:r>
+                  <m:t>e</m:t>
+                </m:r>
+              </m:e>
+            </m:acc>
           </m:e>
           <m:sub>
             <m:r>
-              <m:t>t</m:t>
+              <m:t>0</m:t>
             </m:r>
           </m:sub>
         </m:sSub>
       </m:oMath>
       <w:r>
-        <w:t xml:space="preserve">. Over horizon</w:t>
+        <w:t xml:space="preserve">, evaluate</w:t>
       </w:r>
       <w:r>
         <w:t xml:space="preserve"> </w:t>
@@ -1148,7 +1172,10 @@
         </m:r>
       </m:oMath>
       <w:r>
-        <w:t xml:space="preserve">, we compare permitted policies by</w:t>
+        <w:t xml:space="preserve"> </w:t>
+      </w:r>
+      <w:r>
+        <w:t xml:space="preserve">actions by subsequent exposure:</w:t>
       </w:r>
     </w:p>
     <w:p>
@@ -1261,12 +1288,21 @@
                     <m:t>=</m:t>
                   </m:r>
                   <m:r>
-                    <m:t>1</m:t>
+                    <m:t>0</m:t>
                   </m:r>
                 </m:sub>
                 <m:sup>
                   <m:r>
                     <m:t>T</m:t>
+                  </m:r>
+                  <m:r>
+                    <m:rPr>
+                      <m:sty m:val="p"/>
+                    </m:rPr>
+                    <m:t>−</m:t>
+                  </m:r>
+                  <m:r>
+                    <m:t>1</m:t>
                   </m:r>
                 </m:sup>
                 <m:e>
@@ -1302,6 +1338,15 @@
                     <m:sub>
                       <m:r>
                         <m:t>t</m:t>
+                      </m:r>
+                      <m:r>
+                        <m:rPr>
+                          <m:sty m:val="p"/>
+                        </m:rPr>
+                        <m:t>+</m:t>
+                      </m:r>
+                      <m:r>
+                        <m:t>1</m:t>
                       </m:r>
                     </m:sub>
                   </m:sSub>
@@ -1504,7 +1549,57 @@
         <w:t xml:space="preserve"> </w:t>
       </w:r>
       <w:r>
-        <w:t xml:space="preserve">contains permitted policies and the expectation averages over random recommendations and responses. The loss</w:t>
+        <w:t xml:space="preserve">contains permitted policies; expectations average over random recommendations and responses. Action</w:t>
+      </w:r>
+      <w:r>
+        <w:t xml:space="preserve"> </w:t>
+      </w:r>
+      <m:oMath>
+        <m:sSub>
+          <m:e>
+            <m:r>
+              <m:t>a</m:t>
+            </m:r>
+          </m:e>
+          <m:sub>
+            <m:r>
+              <m:t>t</m:t>
+            </m:r>
+          </m:sub>
+        </m:sSub>
+      </m:oMath>
+      <w:r>
+        <w:t xml:space="preserve"> </w:t>
+      </w:r>
+      <w:r>
+        <w:t xml:space="preserve">affects future exposure, not recorded</w:t>
+      </w:r>
+      <w:r>
+        <w:t xml:space="preserve"> </w:t>
+      </w:r>
+      <m:oMath>
+        <m:sSub>
+          <m:e>
+            <m:acc>
+              <m:accPr>
+                <m:chr m:val="̂"/>
+              </m:accPr>
+              <m:e>
+                <m:r>
+                  <m:t>e</m:t>
+                </m:r>
+              </m:e>
+            </m:acc>
+          </m:e>
+          <m:sub>
+            <m:r>
+              <m:t>t</m:t>
+            </m:r>
+          </m:sub>
+        </m:sSub>
+      </m:oMath>
+      <w:r>
+        <w:t xml:space="preserve">. Loss</w:t>
       </w:r>
       <w:r>
         <w:t xml:space="preserve"> </w:t>
@@ -1544,7 +1639,7 @@
         <w:t xml:space="preserve"> </w:t>
       </w:r>
       <w:r>
-        <w:t xml:space="preserve">is effort and</w:t>
+        <w:t xml:space="preserve">totals these actions’ costs and</w:t>
       </w:r>
       <w:r>
         <w:t xml:space="preserve"> </w:t>
@@ -1567,7 +1662,7 @@
         <w:t xml:space="preserve"> </w:t>
       </w:r>
       <w:r>
-        <w:t xml:space="preserve">retention relative to no intervention. Budget</w:t>
+        <w:t xml:space="preserve">measures subsequent information retention relative to no intervention. Scenarios or users set budget</w:t>
       </w:r>
       <w:r>
         <w:t xml:space="preserve"> </w:t>
@@ -1578,7 +1673,7 @@
         </m:r>
       </m:oMath>
       <w:r>
-        <w:t xml:space="preserve">, minimum retention</w:t>
+        <w:t xml:space="preserve">, retention threshold</w:t>
       </w:r>
       <w:r>
         <w:t xml:space="preserve"> </w:t>
@@ -1592,7 +1687,7 @@
         <w:t xml:space="preserve"> </w:t>
       </w:r>
       <w:r>
-        <w:t xml:space="preserve">and measurement rules are fixed by test scenarios or user confirmation. Unknown content and empty feeds cannot count as success. In the parenting example, loss tracks sweeping claims and retention tracks practical advice and distinct explanations. Additional reasons require documented sources.</w:t>
+        <w:t xml:space="preserve">and measurement rules. Unknown content and empty feeds cannot count as success. In the parenting example, loss tracks sweeping claims and retention tracks practical advice and distinct explanations. Additional reasons require documented sources.</w:t>
       </w:r>
     </w:p>
     <w:p>
@@ -1601,7 +1696,7 @@
         <w:widowControl/>
       </w:pPr>
       <w:r>
-        <w:t xml:space="preserve">We will enumerate no-intervention, topic-filtering, negative-feedback, selective-filtering-plus-supplementation, and search/follow policies. Simulation estimates outcomes; infeasible candidates are excluded. If none qualifies, we report no feasible option. Given these estimates, selection is linear in candidate count. Platform actions and external-tool functions remain distinct. We do not claim global optimality.</w:t>
+        <w:t xml:space="preserve">We will enumerate no-intervention, topic-filtering, negative-feedback, selective-filtering-plus-supplementation, and search/follow policies. Simulation estimates outcomes; we reject infeasible candidates and report if none qualifies. Given these estimates, selection is linear in candidate count. Platform actions and external-tool functions remain distinct. We do not claim global optimality.</w:t>
       </w:r>
     </w:p>
     <w:bookmarkEnd w:id="22"/>
@@ -1655,7 +1750,7 @@
         </m:r>
       </m:oMath>
       <w:r>
-        <w:t xml:space="preserve">, the recommender</w:t>
+        <w:t xml:space="preserve">, recommender</w:t>
       </w:r>
       <w:r>
         <w:t xml:space="preserve"> </w:t>
@@ -1673,7 +1768,7 @@
         <w:t xml:space="preserve"> </w:t>
       </w:r>
       <w:r>
-        <w:t xml:space="preserve">generates exposure</w:t>
+        <w:t xml:space="preserve">produces exposure</w:t>
       </w:r>
       <w:r>
         <w:t xml:space="preserve"> </w:t>
@@ -1693,7 +1788,7 @@
         </m:sSub>
       </m:oMath>
       <w:r>
-        <w:t xml:space="preserve">, the user model</w:t>
+        <w:t xml:space="preserve">, user model</w:t>
       </w:r>
       <w:r>
         <w:t xml:space="preserve"> </w:t>
@@ -1711,7 +1806,7 @@
         <w:t xml:space="preserve"> </w:t>
       </w:r>
       <w:r>
-        <w:t xml:space="preserve">generates feedback</w:t>
+        <w:t xml:space="preserve">produces feedback</w:t>
       </w:r>
       <w:r>
         <w:t xml:space="preserve"> </w:t>
@@ -1731,7 +1826,7 @@
         </m:sSub>
       </m:oMath>
       <w:r>
-        <w:t xml:space="preserve">, and the selected action</w:t>
+        <w:t xml:space="preserve">, and action</w:t>
       </w:r>
       <w:r>
         <w:t xml:space="preserve"> </w:t>
@@ -1754,7 +1849,7 @@
         <w:t xml:space="preserve"> </w:t>
       </w:r>
       <w:r>
-        <w:t xml:space="preserve">enters the state-update rule</w:t>
+        <w:t xml:space="preserve">enters update rule</w:t>
       </w:r>
       <w:r>
         <w:t xml:space="preserve"> </w:t>

</xml_diff>

<commit_message>
Simplify loss indexing while retaining explicit action timing
</commit_message>
<xml_diff>
--- a/docs/project-plan/submission/Project_Plan_EN.docx
+++ b/docs/project-plan/submission/Project_Plan_EN.docx
@@ -1134,7 +1134,7 @@
         </m:d>
       </m:oMath>
       <w:r>
-        <w:t xml:space="preserve">. From observed</w:t>
+        <w:t xml:space="preserve">. Starting from</w:t>
       </w:r>
       <w:r>
         <w:t xml:space="preserve"> </w:t>
@@ -1161,21 +1161,133 @@
         </m:sSub>
       </m:oMath>
       <w:r>
-        <w:t xml:space="preserve">, evaluate</w:t>
+        <w:t xml:space="preserve">, actions</w:t>
       </w:r>
       <w:r>
         <w:t xml:space="preserve"> </w:t>
       </w:r>
       <m:oMath>
+        <m:sSub>
+          <m:e>
+            <m:r>
+              <m:t>a</m:t>
+            </m:r>
+          </m:e>
+          <m:sub>
+            <m:r>
+              <m:t>0</m:t>
+            </m:r>
+          </m:sub>
+        </m:sSub>
         <m:r>
-          <m:t>T</m:t>
+          <m:rPr>
+            <m:sty m:val="p"/>
+          </m:rPr>
+          <m:t>,</m:t>
         </m:r>
+        <m:r>
+          <m:rPr>
+            <m:sty m:val="p"/>
+          </m:rPr>
+          <m:t>…</m:t>
+        </m:r>
+        <m:r>
+          <m:rPr>
+            <m:sty m:val="p"/>
+          </m:rPr>
+          <m:t>,</m:t>
+        </m:r>
+        <m:sSub>
+          <m:e>
+            <m:r>
+              <m:t>a</m:t>
+            </m:r>
+          </m:e>
+          <m:sub>
+            <m:r>
+              <m:t>T</m:t>
+            </m:r>
+            <m:r>
+              <m:rPr>
+                <m:sty m:val="p"/>
+              </m:rPr>
+              <m:t>−</m:t>
+            </m:r>
+            <m:r>
+              <m:t>1</m:t>
+            </m:r>
+          </m:sub>
+        </m:sSub>
       </m:oMath>
       <w:r>
         <w:t xml:space="preserve"> </w:t>
       </w:r>
       <w:r>
-        <w:t xml:space="preserve">actions by subsequent exposure:</w:t>
+        <w:t xml:space="preserve">produce the evaluated summaries</w:t>
+      </w:r>
+      <w:r>
+        <w:t xml:space="preserve"> </w:t>
+      </w:r>
+      <m:oMath>
+        <m:sSub>
+          <m:e>
+            <m:acc>
+              <m:accPr>
+                <m:chr m:val="̂"/>
+              </m:accPr>
+              <m:e>
+                <m:r>
+                  <m:t>e</m:t>
+                </m:r>
+              </m:e>
+            </m:acc>
+          </m:e>
+          <m:sub>
+            <m:r>
+              <m:t>1</m:t>
+            </m:r>
+          </m:sub>
+        </m:sSub>
+        <m:r>
+          <m:rPr>
+            <m:sty m:val="p"/>
+          </m:rPr>
+          <m:t>,</m:t>
+        </m:r>
+        <m:r>
+          <m:rPr>
+            <m:sty m:val="p"/>
+          </m:rPr>
+          <m:t>…</m:t>
+        </m:r>
+        <m:r>
+          <m:rPr>
+            <m:sty m:val="p"/>
+          </m:rPr>
+          <m:t>,</m:t>
+        </m:r>
+        <m:sSub>
+          <m:e>
+            <m:acc>
+              <m:accPr>
+                <m:chr m:val="̂"/>
+              </m:accPr>
+              <m:e>
+                <m:r>
+                  <m:t>e</m:t>
+                </m:r>
+              </m:e>
+            </m:acc>
+          </m:e>
+          <m:sub>
+            <m:r>
+              <m:t>T</m:t>
+            </m:r>
+          </m:sub>
+        </m:sSub>
+      </m:oMath>
+      <w:r>
+        <w:t xml:space="preserve">:</w:t>
       </w:r>
     </w:p>
     <w:p>
@@ -1288,21 +1400,12 @@
                     <m:t>=</m:t>
                   </m:r>
                   <m:r>
-                    <m:t>0</m:t>
+                    <m:t>1</m:t>
                   </m:r>
                 </m:sub>
                 <m:sup>
                   <m:r>
                     <m:t>T</m:t>
-                  </m:r>
-                  <m:r>
-                    <m:rPr>
-                      <m:sty m:val="p"/>
-                    </m:rPr>
-                    <m:t>−</m:t>
-                  </m:r>
-                  <m:r>
-                    <m:t>1</m:t>
                   </m:r>
                 </m:sup>
                 <m:e>
@@ -1338,15 +1441,6 @@
                     <m:sub>
                       <m:r>
                         <m:t>t</m:t>
-                      </m:r>
-                      <m:r>
-                        <m:rPr>
-                          <m:sty m:val="p"/>
-                        </m:rPr>
-                        <m:t>+</m:t>
-                      </m:r>
-                      <m:r>
-                        <m:t>1</m:t>
                       </m:r>
                     </m:sub>
                   </m:sSub>

</xml_diff>

<commit_message>
Revert "Align intervention objective with subsequent exposure and horizon"
This reverts commit 1a16857a0cb967a5f0d776da1ce04cc5bdea593c.
</commit_message>
<xml_diff>
--- a/docs/project-plan/submission/Project_Plan_EN.docx
+++ b/docs/project-plan/submission/Project_Plan_EN.docx
@@ -995,7 +995,7 @@
         <w:widowControl/>
       </w:pPr>
       <w:r>
-        <w:t xml:space="preserve">Double annotation, precision/recall, modality comparisons and a held-out issue will test measurement quality; sparse histories remain unscored. Alternative plausible labels will test sensitivity to classification errors.</w:t>
+        <w:t xml:space="preserve">Independent double annotation, precision/recall, modality comparisons and a held-out issue will test measurement quality; sparse histories will remain unscored. Disagreements and alternative plausible labels for uncertain items will test whether classification errors change the conclusions.</w:t>
       </w:r>
     </w:p>
     <w:bookmarkEnd w:id="21"/>
@@ -1015,41 +1015,7 @@
         <w:widowControl/>
       </w:pPr>
       <w:r>
-        <w:t xml:space="preserve">Given the summary, confirmed reduce–retain–explore goal</w:t>
-      </w:r>
-      <w:r>
-        <w:t xml:space="preserve"> </w:t>
-      </w:r>
-      <m:oMath>
-        <m:r>
-          <m:t>g</m:t>
-        </m:r>
-      </m:oMath>
-      <w:r>
-        <w:t xml:space="preserve"> </w:t>
-      </w:r>
-      <w:r>
-        <w:t xml:space="preserve">and remaining budget</w:t>
-      </w:r>
-      <w:r>
-        <w:t xml:space="preserve"> </w:t>
-      </w:r>
-      <m:oMath>
-        <m:sSub>
-          <m:e>
-            <m:r>
-              <m:t>b</m:t>
-            </m:r>
-          </m:e>
-          <m:sub>
-            <m:r>
-              <m:t>t</m:t>
-            </m:r>
-          </m:sub>
-        </m:sSub>
-      </m:oMath>
-      <w:r>
-        <w:t xml:space="preserve">, a policy chooses</w:t>
+        <w:t xml:space="preserve">An action-selection policy chooses</w:t>
       </w:r>
       <w:r>
         <w:t xml:space="preserve"> </w:t>
@@ -1134,7 +1100,24 @@
         </m:d>
       </m:oMath>
       <w:r>
-        <w:t xml:space="preserve">. From observed</w:t>
+        <w:t xml:space="preserve"> </w:t>
+      </w:r>
+      <w:r>
+        <w:t xml:space="preserve">using the exposure summary, a confirmed reduce–retain–explore goal</w:t>
+      </w:r>
+      <w:r>
+        <w:t xml:space="preserve"> </w:t>
+      </w:r>
+      <m:oMath>
+        <m:r>
+          <m:t>g</m:t>
+        </m:r>
+      </m:oMath>
+      <w:r>
+        <w:t xml:space="preserve"> </w:t>
+      </w:r>
+      <w:r>
+        <w:t xml:space="preserve">and remaining budget</w:t>
       </w:r>
       <w:r>
         <w:t xml:space="preserve"> </w:t>
@@ -1142,26 +1125,19 @@
       <m:oMath>
         <m:sSub>
           <m:e>
-            <m:acc>
-              <m:accPr>
-                <m:chr m:val="̂"/>
-              </m:accPr>
-              <m:e>
-                <m:r>
-                  <m:t>e</m:t>
-                </m:r>
-              </m:e>
-            </m:acc>
+            <m:r>
+              <m:t>b</m:t>
+            </m:r>
           </m:e>
           <m:sub>
             <m:r>
-              <m:t>0</m:t>
+              <m:t>t</m:t>
             </m:r>
           </m:sub>
         </m:sSub>
       </m:oMath>
       <w:r>
-        <w:t xml:space="preserve">, evaluate</w:t>
+        <w:t xml:space="preserve">. Over horizon</w:t>
       </w:r>
       <w:r>
         <w:t xml:space="preserve"> </w:t>
@@ -1172,10 +1148,7 @@
         </m:r>
       </m:oMath>
       <w:r>
-        <w:t xml:space="preserve"> </w:t>
-      </w:r>
-      <w:r>
-        <w:t xml:space="preserve">actions by subsequent exposure:</w:t>
+        <w:t xml:space="preserve">, we compare permitted policies by</w:t>
       </w:r>
     </w:p>
     <w:p>
@@ -1288,21 +1261,12 @@
                     <m:t>=</m:t>
                   </m:r>
                   <m:r>
-                    <m:t>0</m:t>
+                    <m:t>1</m:t>
                   </m:r>
                 </m:sub>
                 <m:sup>
                   <m:r>
                     <m:t>T</m:t>
-                  </m:r>
-                  <m:r>
-                    <m:rPr>
-                      <m:sty m:val="p"/>
-                    </m:rPr>
-                    <m:t>−</m:t>
-                  </m:r>
-                  <m:r>
-                    <m:t>1</m:t>
                   </m:r>
                 </m:sup>
                 <m:e>
@@ -1338,15 +1302,6 @@
                     <m:sub>
                       <m:r>
                         <m:t>t</m:t>
-                      </m:r>
-                      <m:r>
-                        <m:rPr>
-                          <m:sty m:val="p"/>
-                        </m:rPr>
-                        <m:t>+</m:t>
-                      </m:r>
-                      <m:r>
-                        <m:t>1</m:t>
                       </m:r>
                     </m:sub>
                   </m:sSub>
@@ -1549,7 +1504,234 @@
         <w:t xml:space="preserve"> </w:t>
       </w:r>
       <w:r>
-        <w:t xml:space="preserve">contains permitted policies; expectations average over random recommendations and responses. Action</w:t>
+        <w:t xml:space="preserve">contains permitted policies and the expectation averages over random recommendations and responses. The loss</w:t>
+      </w:r>
+      <w:r>
+        <w:t xml:space="preserve"> </w:t>
+      </w:r>
+      <m:oMath>
+        <m:r>
+          <m:rPr>
+            <m:sty m:val="p"/>
+          </m:rPr>
+          <m:t>ℓ</m:t>
+        </m:r>
+      </m:oMath>
+      <w:r>
+        <w:t xml:space="preserve"> </w:t>
+      </w:r>
+      <w:r>
+        <w:t xml:space="preserve">measures goal mismatch;</w:t>
+      </w:r>
+      <w:r>
+        <w:t xml:space="preserve"> </w:t>
+      </w:r>
+      <m:oMath>
+        <m:sSub>
+          <m:e>
+            <m:r>
+              <m:t>C</m:t>
+            </m:r>
+          </m:e>
+          <m:sub>
+            <m:r>
+              <m:t>T</m:t>
+            </m:r>
+          </m:sub>
+        </m:sSub>
+      </m:oMath>
+      <w:r>
+        <w:t xml:space="preserve"> </w:t>
+      </w:r>
+      <w:r>
+        <w:t xml:space="preserve">is effort and</w:t>
+      </w:r>
+      <w:r>
+        <w:t xml:space="preserve"> </w:t>
+      </w:r>
+      <m:oMath>
+        <m:sSub>
+          <m:e>
+            <m:r>
+              <m:t>R</m:t>
+            </m:r>
+          </m:e>
+          <m:sub>
+            <m:r>
+              <m:t>T</m:t>
+            </m:r>
+          </m:sub>
+        </m:sSub>
+      </m:oMath>
+      <w:r>
+        <w:t xml:space="preserve"> </w:t>
+      </w:r>
+      <w:r>
+        <w:t xml:space="preserve">retention relative to no intervention. Budget</w:t>
+      </w:r>
+      <w:r>
+        <w:t xml:space="preserve"> </w:t>
+      </w:r>
+      <m:oMath>
+        <m:r>
+          <m:t>B</m:t>
+        </m:r>
+      </m:oMath>
+      <w:r>
+        <w:t xml:space="preserve">, minimum retention</w:t>
+      </w:r>
+      <w:r>
+        <w:t xml:space="preserve"> </w:t>
+      </w:r>
+      <m:oMath>
+        <m:r>
+          <m:t>ρ</m:t>
+        </m:r>
+      </m:oMath>
+      <w:r>
+        <w:t xml:space="preserve"> </w:t>
+      </w:r>
+      <w:r>
+        <w:t xml:space="preserve">and measurement rules are fixed by test scenarios or user confirmation. Unknown content and empty feeds cannot count as success. In the parenting example, loss tracks sweeping claims and retention tracks practical advice and distinct explanations. Additional reasons require documented sources.</w:t>
+      </w:r>
+    </w:p>
+    <w:p>
+      <w:pPr>
+        <w:pStyle w:val="BodyText"/>
+        <w:widowControl/>
+      </w:pPr>
+      <w:r>
+        <w:t xml:space="preserve">We will enumerate no-intervention, topic-filtering, negative-feedback, selective-filtering-plus-supplementation, and search/follow policies. Simulation estimates outcomes; infeasible candidates are excluded. If none qualifies, we report no feasible option. Given these estimates, selection is linear in candidate count. Platform actions and external-tool functions remain distinct. We do not claim global optimality.</w:t>
+      </w:r>
+    </w:p>
+    <w:bookmarkEnd w:id="22"/>
+    <w:bookmarkStart w:id="23" w:name="X7c4955de59ee35115204917af57a512f46c4580"/>
+    <w:p>
+      <w:pPr>
+        <w:pStyle w:val="Heading2"/>
+        <w:widowControl/>
+      </w:pPr>
+      <w:r>
+        <w:t xml:space="preserve">Simulation: testing the recommendation–feedback loop</w:t>
+      </w:r>
+    </w:p>
+    <w:p>
+      <w:pPr>
+        <w:pStyle w:val="FirstParagraph"/>
+        <w:widowControl/>
+      </w:pPr>
+      <w:r>
+        <w:t xml:space="preserve">Let</w:t>
+      </w:r>
+      <w:r>
+        <w:t xml:space="preserve"> </w:t>
+      </w:r>
+      <m:oMath>
+        <m:sSub>
+          <m:e>
+            <m:r>
+              <m:t>s</m:t>
+            </m:r>
+          </m:e>
+          <m:sub>
+            <m:r>
+              <m:t>t</m:t>
+            </m:r>
+          </m:sub>
+        </m:sSub>
+      </m:oMath>
+      <w:r>
+        <w:t xml:space="preserve"> </w:t>
+      </w:r>
+      <w:r>
+        <w:t xml:space="preserve">contain recommendation history and user behavioural state. At step</w:t>
+      </w:r>
+      <w:r>
+        <w:t xml:space="preserve"> </w:t>
+      </w:r>
+      <m:oMath>
+        <m:r>
+          <m:t>t</m:t>
+        </m:r>
+      </m:oMath>
+      <w:r>
+        <w:t xml:space="preserve">, the recommender</w:t>
+      </w:r>
+      <w:r>
+        <w:t xml:space="preserve"> </w:t>
+      </w:r>
+      <m:oMath>
+        <m:r>
+          <m:rPr>
+            <m:sty m:val="p"/>
+            <m:scr m:val="script"/>
+          </m:rPr>
+          <m:t>R</m:t>
+        </m:r>
+      </m:oMath>
+      <w:r>
+        <w:t xml:space="preserve"> </w:t>
+      </w:r>
+      <w:r>
+        <w:t xml:space="preserve">generates exposure</w:t>
+      </w:r>
+      <w:r>
+        <w:t xml:space="preserve"> </w:t>
+      </w:r>
+      <m:oMath>
+        <m:sSub>
+          <m:e>
+            <m:r>
+              <m:t>x</m:t>
+            </m:r>
+          </m:e>
+          <m:sub>
+            <m:r>
+              <m:t>t</m:t>
+            </m:r>
+          </m:sub>
+        </m:sSub>
+      </m:oMath>
+      <w:r>
+        <w:t xml:space="preserve">, the user model</w:t>
+      </w:r>
+      <w:r>
+        <w:t xml:space="preserve"> </w:t>
+      </w:r>
+      <m:oMath>
+        <m:r>
+          <m:rPr>
+            <m:sty m:val="p"/>
+            <m:scr m:val="script"/>
+          </m:rPr>
+          <m:t>U</m:t>
+        </m:r>
+      </m:oMath>
+      <w:r>
+        <w:t xml:space="preserve"> </w:t>
+      </w:r>
+      <w:r>
+        <w:t xml:space="preserve">generates feedback</w:t>
+      </w:r>
+      <w:r>
+        <w:t xml:space="preserve"> </w:t>
+      </w:r>
+      <m:oMath>
+        <m:sSub>
+          <m:e>
+            <m:r>
+              <m:t>y</m:t>
+            </m:r>
+          </m:e>
+          <m:sub>
+            <m:r>
+              <m:t>t</m:t>
+            </m:r>
+          </m:sub>
+        </m:sSub>
+      </m:oMath>
+      <w:r>
+        <w:t xml:space="preserve">, and the selected action</w:t>
       </w:r>
       <w:r>
         <w:t xml:space="preserve"> </w:t>
@@ -1572,284 +1754,7 @@
         <w:t xml:space="preserve"> </w:t>
       </w:r>
       <w:r>
-        <w:t xml:space="preserve">affects future exposure, not recorded</w:t>
-      </w:r>
-      <w:r>
-        <w:t xml:space="preserve"> </w:t>
-      </w:r>
-      <m:oMath>
-        <m:sSub>
-          <m:e>
-            <m:acc>
-              <m:accPr>
-                <m:chr m:val="̂"/>
-              </m:accPr>
-              <m:e>
-                <m:r>
-                  <m:t>e</m:t>
-                </m:r>
-              </m:e>
-            </m:acc>
-          </m:e>
-          <m:sub>
-            <m:r>
-              <m:t>t</m:t>
-            </m:r>
-          </m:sub>
-        </m:sSub>
-      </m:oMath>
-      <w:r>
-        <w:t xml:space="preserve">. Loss</w:t>
-      </w:r>
-      <w:r>
-        <w:t xml:space="preserve"> </w:t>
-      </w:r>
-      <m:oMath>
-        <m:r>
-          <m:rPr>
-            <m:sty m:val="p"/>
-          </m:rPr>
-          <m:t>ℓ</m:t>
-        </m:r>
-      </m:oMath>
-      <w:r>
-        <w:t xml:space="preserve"> </w:t>
-      </w:r>
-      <w:r>
-        <w:t xml:space="preserve">measures goal mismatch;</w:t>
-      </w:r>
-      <w:r>
-        <w:t xml:space="preserve"> </w:t>
-      </w:r>
-      <m:oMath>
-        <m:sSub>
-          <m:e>
-            <m:r>
-              <m:t>C</m:t>
-            </m:r>
-          </m:e>
-          <m:sub>
-            <m:r>
-              <m:t>T</m:t>
-            </m:r>
-          </m:sub>
-        </m:sSub>
-      </m:oMath>
-      <w:r>
-        <w:t xml:space="preserve"> </w:t>
-      </w:r>
-      <w:r>
-        <w:t xml:space="preserve">totals these actions’ costs and</w:t>
-      </w:r>
-      <w:r>
-        <w:t xml:space="preserve"> </w:t>
-      </w:r>
-      <m:oMath>
-        <m:sSub>
-          <m:e>
-            <m:r>
-              <m:t>R</m:t>
-            </m:r>
-          </m:e>
-          <m:sub>
-            <m:r>
-              <m:t>T</m:t>
-            </m:r>
-          </m:sub>
-        </m:sSub>
-      </m:oMath>
-      <w:r>
-        <w:t xml:space="preserve"> </w:t>
-      </w:r>
-      <w:r>
-        <w:t xml:space="preserve">measures subsequent information retention relative to no intervention. Scenarios or users set budget</w:t>
-      </w:r>
-      <w:r>
-        <w:t xml:space="preserve"> </w:t>
-      </w:r>
-      <m:oMath>
-        <m:r>
-          <m:t>B</m:t>
-        </m:r>
-      </m:oMath>
-      <w:r>
-        <w:t xml:space="preserve">, retention threshold</w:t>
-      </w:r>
-      <w:r>
-        <w:t xml:space="preserve"> </w:t>
-      </w:r>
-      <m:oMath>
-        <m:r>
-          <m:t>ρ</m:t>
-        </m:r>
-      </m:oMath>
-      <w:r>
-        <w:t xml:space="preserve"> </w:t>
-      </w:r>
-      <w:r>
-        <w:t xml:space="preserve">and measurement rules. Unknown content and empty feeds cannot count as success. In the parenting example, loss tracks sweeping claims and retention tracks practical advice and distinct explanations. Additional reasons require documented sources.</w:t>
-      </w:r>
-    </w:p>
-    <w:p>
-      <w:pPr>
-        <w:pStyle w:val="BodyText"/>
-        <w:widowControl/>
-      </w:pPr>
-      <w:r>
-        <w:t xml:space="preserve">We will enumerate no-intervention, topic-filtering, negative-feedback, selective-filtering-plus-supplementation, and search/follow policies. Simulation estimates outcomes; we reject infeasible candidates and report if none qualifies. Given these estimates, selection is linear in candidate count. Platform actions and external-tool functions remain distinct. We do not claim global optimality.</w:t>
-      </w:r>
-    </w:p>
-    <w:bookmarkEnd w:id="22"/>
-    <w:bookmarkStart w:id="23" w:name="X7c4955de59ee35115204917af57a512f46c4580"/>
-    <w:p>
-      <w:pPr>
-        <w:pStyle w:val="Heading2"/>
-        <w:widowControl/>
-      </w:pPr>
-      <w:r>
-        <w:t xml:space="preserve">Simulation: testing the recommendation–feedback loop</w:t>
-      </w:r>
-    </w:p>
-    <w:p>
-      <w:pPr>
-        <w:pStyle w:val="FirstParagraph"/>
-        <w:widowControl/>
-      </w:pPr>
-      <w:r>
-        <w:t xml:space="preserve">Let</w:t>
-      </w:r>
-      <w:r>
-        <w:t xml:space="preserve"> </w:t>
-      </w:r>
-      <m:oMath>
-        <m:sSub>
-          <m:e>
-            <m:r>
-              <m:t>s</m:t>
-            </m:r>
-          </m:e>
-          <m:sub>
-            <m:r>
-              <m:t>t</m:t>
-            </m:r>
-          </m:sub>
-        </m:sSub>
-      </m:oMath>
-      <w:r>
-        <w:t xml:space="preserve"> </w:t>
-      </w:r>
-      <w:r>
-        <w:t xml:space="preserve">contain recommendation history and user behavioural state. At step</w:t>
-      </w:r>
-      <w:r>
-        <w:t xml:space="preserve"> </w:t>
-      </w:r>
-      <m:oMath>
-        <m:r>
-          <m:t>t</m:t>
-        </m:r>
-      </m:oMath>
-      <w:r>
-        <w:t xml:space="preserve">, recommender</w:t>
-      </w:r>
-      <w:r>
-        <w:t xml:space="preserve"> </w:t>
-      </w:r>
-      <m:oMath>
-        <m:r>
-          <m:rPr>
-            <m:sty m:val="p"/>
-            <m:scr m:val="script"/>
-          </m:rPr>
-          <m:t>R</m:t>
-        </m:r>
-      </m:oMath>
-      <w:r>
-        <w:t xml:space="preserve"> </w:t>
-      </w:r>
-      <w:r>
-        <w:t xml:space="preserve">produces exposure</w:t>
-      </w:r>
-      <w:r>
-        <w:t xml:space="preserve"> </w:t>
-      </w:r>
-      <m:oMath>
-        <m:sSub>
-          <m:e>
-            <m:r>
-              <m:t>x</m:t>
-            </m:r>
-          </m:e>
-          <m:sub>
-            <m:r>
-              <m:t>t</m:t>
-            </m:r>
-          </m:sub>
-        </m:sSub>
-      </m:oMath>
-      <w:r>
-        <w:t xml:space="preserve">, user model</w:t>
-      </w:r>
-      <w:r>
-        <w:t xml:space="preserve"> </w:t>
-      </w:r>
-      <m:oMath>
-        <m:r>
-          <m:rPr>
-            <m:sty m:val="p"/>
-            <m:scr m:val="script"/>
-          </m:rPr>
-          <m:t>U</m:t>
-        </m:r>
-      </m:oMath>
-      <w:r>
-        <w:t xml:space="preserve"> </w:t>
-      </w:r>
-      <w:r>
-        <w:t xml:space="preserve">produces feedback</w:t>
-      </w:r>
-      <w:r>
-        <w:t xml:space="preserve"> </w:t>
-      </w:r>
-      <m:oMath>
-        <m:sSub>
-          <m:e>
-            <m:r>
-              <m:t>y</m:t>
-            </m:r>
-          </m:e>
-          <m:sub>
-            <m:r>
-              <m:t>t</m:t>
-            </m:r>
-          </m:sub>
-        </m:sSub>
-      </m:oMath>
-      <w:r>
-        <w:t xml:space="preserve">, and action</w:t>
-      </w:r>
-      <w:r>
-        <w:t xml:space="preserve"> </w:t>
-      </w:r>
-      <m:oMath>
-        <m:sSub>
-          <m:e>
-            <m:r>
-              <m:t>a</m:t>
-            </m:r>
-          </m:e>
-          <m:sub>
-            <m:r>
-              <m:t>t</m:t>
-            </m:r>
-          </m:sub>
-        </m:sSub>
-      </m:oMath>
-      <w:r>
-        <w:t xml:space="preserve"> </w:t>
-      </w:r>
-      <w:r>
-        <w:t xml:space="preserve">enters update rule</w:t>
+        <w:t xml:space="preserve">enters the state-update rule</w:t>
       </w:r>
       <w:r>
         <w:t xml:space="preserve"> </w:t>

</xml_diff>

<commit_message>
Revert "Simplify loss indexing while retaining explicit action timing"
This reverts commit 1879a0ef5d33e54b328e32f64f1de4b2e22f037c.
</commit_message>
<xml_diff>
--- a/docs/project-plan/submission/Project_Plan_EN.docx
+++ b/docs/project-plan/submission/Project_Plan_EN.docx
@@ -1134,7 +1134,7 @@
         </m:d>
       </m:oMath>
       <w:r>
-        <w:t xml:space="preserve">. Starting from</w:t>
+        <w:t xml:space="preserve">. From observed</w:t>
       </w:r>
       <w:r>
         <w:t xml:space="preserve"> </w:t>
@@ -1161,133 +1161,21 @@
         </m:sSub>
       </m:oMath>
       <w:r>
-        <w:t xml:space="preserve">, actions</w:t>
+        <w:t xml:space="preserve">, evaluate</w:t>
       </w:r>
       <w:r>
         <w:t xml:space="preserve"> </w:t>
       </w:r>
       <m:oMath>
-        <m:sSub>
-          <m:e>
-            <m:r>
-              <m:t>a</m:t>
-            </m:r>
-          </m:e>
-          <m:sub>
-            <m:r>
-              <m:t>0</m:t>
-            </m:r>
-          </m:sub>
-        </m:sSub>
         <m:r>
-          <m:rPr>
-            <m:sty m:val="p"/>
-          </m:rPr>
-          <m:t>,</m:t>
+          <m:t>T</m:t>
         </m:r>
-        <m:r>
-          <m:rPr>
-            <m:sty m:val="p"/>
-          </m:rPr>
-          <m:t>…</m:t>
-        </m:r>
-        <m:r>
-          <m:rPr>
-            <m:sty m:val="p"/>
-          </m:rPr>
-          <m:t>,</m:t>
-        </m:r>
-        <m:sSub>
-          <m:e>
-            <m:r>
-              <m:t>a</m:t>
-            </m:r>
-          </m:e>
-          <m:sub>
-            <m:r>
-              <m:t>T</m:t>
-            </m:r>
-            <m:r>
-              <m:rPr>
-                <m:sty m:val="p"/>
-              </m:rPr>
-              <m:t>−</m:t>
-            </m:r>
-            <m:r>
-              <m:t>1</m:t>
-            </m:r>
-          </m:sub>
-        </m:sSub>
       </m:oMath>
       <w:r>
         <w:t xml:space="preserve"> </w:t>
       </w:r>
       <w:r>
-        <w:t xml:space="preserve">produce the evaluated summaries</w:t>
-      </w:r>
-      <w:r>
-        <w:t xml:space="preserve"> </w:t>
-      </w:r>
-      <m:oMath>
-        <m:sSub>
-          <m:e>
-            <m:acc>
-              <m:accPr>
-                <m:chr m:val="̂"/>
-              </m:accPr>
-              <m:e>
-                <m:r>
-                  <m:t>e</m:t>
-                </m:r>
-              </m:e>
-            </m:acc>
-          </m:e>
-          <m:sub>
-            <m:r>
-              <m:t>1</m:t>
-            </m:r>
-          </m:sub>
-        </m:sSub>
-        <m:r>
-          <m:rPr>
-            <m:sty m:val="p"/>
-          </m:rPr>
-          <m:t>,</m:t>
-        </m:r>
-        <m:r>
-          <m:rPr>
-            <m:sty m:val="p"/>
-          </m:rPr>
-          <m:t>…</m:t>
-        </m:r>
-        <m:r>
-          <m:rPr>
-            <m:sty m:val="p"/>
-          </m:rPr>
-          <m:t>,</m:t>
-        </m:r>
-        <m:sSub>
-          <m:e>
-            <m:acc>
-              <m:accPr>
-                <m:chr m:val="̂"/>
-              </m:accPr>
-              <m:e>
-                <m:r>
-                  <m:t>e</m:t>
-                </m:r>
-              </m:e>
-            </m:acc>
-          </m:e>
-          <m:sub>
-            <m:r>
-              <m:t>T</m:t>
-            </m:r>
-          </m:sub>
-        </m:sSub>
-      </m:oMath>
-      <w:r>
-        <w:t xml:space="preserve">:</w:t>
+        <w:t xml:space="preserve">actions by subsequent exposure:</w:t>
       </w:r>
     </w:p>
     <w:p>
@@ -1400,12 +1288,21 @@
                     <m:t>=</m:t>
                   </m:r>
                   <m:r>
-                    <m:t>1</m:t>
+                    <m:t>0</m:t>
                   </m:r>
                 </m:sub>
                 <m:sup>
                   <m:r>
                     <m:t>T</m:t>
+                  </m:r>
+                  <m:r>
+                    <m:rPr>
+                      <m:sty m:val="p"/>
+                    </m:rPr>
+                    <m:t>−</m:t>
+                  </m:r>
+                  <m:r>
+                    <m:t>1</m:t>
                   </m:r>
                 </m:sup>
                 <m:e>
@@ -1441,6 +1338,15 @@
                     <m:sub>
                       <m:r>
                         <m:t>t</m:t>
+                      </m:r>
+                      <m:r>
+                        <m:rPr>
+                          <m:sty m:val="p"/>
+                        </m:rPr>
+                        <m:t>+</m:t>
+                      </m:r>
+                      <m:r>
+                        <m:t>1</m:t>
                       </m:r>
                     </m:sub>
                   </m:sSub>

</xml_diff>

<commit_message>
Integrate team feedback into coherent bilingual project proposals
</commit_message>
<xml_diff>
--- a/docs/project-plan/submission/Project_Plan_EN.docx
+++ b/docs/project-plan/submission/Project_Plan_EN.docx
@@ -2,7 +2,7 @@
 <file path=word/document.xml><?xml version="1.0" encoding="utf-8"?>
 <w:document xmlns:w="http://schemas.openxmlformats.org/wordprocessingml/2006/main" xmlns:m="http://schemas.openxmlformats.org/officeDocument/2006/math" xmlns:r="http://schemas.openxmlformats.org/officeDocument/2006/relationships" xmlns:o="urn:schemas-microsoft-com:office:office" xmlns:v="urn:schemas-microsoft-com:vml" xmlns:w10="urn:schemas-microsoft-com:office:word" xmlns:a="http://schemas.openxmlformats.org/drawingml/2006/main" xmlns:pic="http://schemas.openxmlformats.org/drawingml/2006/picture" xmlns:wp="http://schemas.openxmlformats.org/drawingml/2006/wordprocessingDrawing">
   <w:body>
-    <w:bookmarkStart w:id="49" w:name="keeping-the-topic-widening-the-view"/>
+    <w:bookmarkStart w:id="54" w:name="keeping-the-topic-widening-the-view"/>
     <w:p>
       <w:pPr>
         <w:pStyle w:val="Title"/>
@@ -413,6 +413,15 @@
         <w:widowControl/>
       </w:pPr>
       <w:r>
+        <w:t xml:space="preserve">Users may not know what they are missing. The report therefore compares their exposure with reasons found in a documented issue corpus and offers possible adjustment goals for confirmation. This corpus is a limited reference, not a complete or automatically balanced account of the issue.</w:t>
+      </w:r>
+    </w:p>
+    <w:p>
+      <w:pPr>
+        <w:pStyle w:val="BodyText"/>
+        <w:widowControl/>
+      </w:pPr>
+      <w:r>
         <w:t xml:space="preserve">We will develop the method across at least two issues and evaluate it on a held-out issue. Our main outputs will be an evidence-based report design, a comparison of adaptive intervention policies and a dynamic simulation. An optional tool may demonstrate the process. We will study exposure and control, rather than claim to measure changes in users’ beliefs or well-being.</w:t>
       </w:r>
     </w:p>
@@ -995,7 +1004,7 @@
         <w:widowControl/>
       </w:pPr>
       <w:r>
-        <w:t xml:space="preserve">Independent double annotation, precision/recall, modality comparisons and a held-out issue will test measurement quality; sparse histories will remain unscored. Disagreements and alternative plausible labels for uncertain items will test whether classification errors change the conclusions.</w:t>
+        <w:t xml:space="preserve">Independent double annotation, precision/recall and a held-out issue will test measurement quality. Comparing title-only, transcript-based and visual-context analysis will test whether added modalities resolve errors such as attributing a character’s speech to the creator. Sparse histories will remain unscored. Disagreements and alternative plausible labels for uncertain items will test whether classification errors change the conclusions.</w:t>
       </w:r>
     </w:p>
     <w:bookmarkEnd w:id="21"/>
@@ -1601,7 +1610,7 @@
         <w:widowControl/>
       </w:pPr>
       <w:r>
-        <w:t xml:space="preserve">We will enumerate no-intervention, topic-filtering, negative-feedback, selective-filtering-plus-supplementation, and search/follow policies. Simulation estimates outcomes; infeasible candidates are excluded. If none qualifies, we report no feasible option. Given these estimates, selection is linear in candidate count. Platform actions and external-tool functions remain distinct. We do not claim global optimality.</w:t>
+        <w:t xml:space="preserve">We will enumerate no-intervention, topic-filtering, negative-feedback, selective-filtering-plus-supplementation, and search/follow policies. Simulation estimates outcomes; infeasible candidates are excluded. If none qualifies, we report no feasible option. Given these estimates, selection is linear in candidate count. Comparisons will show whether selective control retains more wanted information than removing the whole topic, and at what cost. Platform actions and external-tool functions remain distinct. We do not claim global optimality.</w:t>
       </w:r>
     </w:p>
     <w:bookmarkEnd w:id="22"/>
@@ -2128,7 +2137,7 @@
         <w:t xml:space="preserve"> </w:t>
       </w:r>
       <w:r>
-        <w:t xml:space="preserve">found that engagement-based ranking and stated preferences did not align for political content on Twitter. Ranking by stated preferences also risked reinforcing agreeable content. This motivates separating what attracts attention from what a user wants, without treating user control as an automatic cure. Vera and Ghosh</w:t>
+        <w:t xml:space="preserve">found that engagement-based ranking and stated preferences did not align for political content on Twitter. Ranking by stated preferences also risked reinforcing agreeable content. Vera and Ghosh</w:t>
       </w:r>
       <w:r>
         <w:t xml:space="preserve"> </w:t>
@@ -2142,7 +2151,10 @@
         </w:r>
       </w:hyperlink>
       <w:r>
-        <w:t xml:space="preserve">, through interviews with 14 TikTok users, documented unwanted recommendations and efforts to remove them. Their findings support our everyday problem, but do not estimate its prevalence among Chinese users.</w:t>
+        <w:t xml:space="preserve"> </w:t>
+      </w:r>
+      <w:r>
+        <w:t xml:space="preserve">interviewed 14 TikTok users about unwanted recommendations and attempts to remove them. These studies motivate separating attention from confirmed goals; they do not establish the problem’s prevalence among Chinese users.</w:t>
       </w:r>
     </w:p>
     <w:p>
@@ -2175,7 +2187,7 @@
         <w:t xml:space="preserve"> </w:t>
       </w:r>
       <w:r>
-        <w:t xml:space="preserve">distinguish topic drift from stance drift in a TikTok audit. Thus, studying viewpoints within a topic is not itself new. Draws et al. </w:t>
+        <w:t xml:space="preserve">distinguish topic drift from stance drift in a TikTok audit, so within-topic viewpoint analysis is not itself new. Draws et al. </w:t>
       </w:r>
       <w:hyperlink w:anchor="ref-4">
         <w:r>
@@ -2189,7 +2201,7 @@
         <w:t xml:space="preserve"> </w:t>
       </w:r>
       <w:r>
-        <w:t xml:space="preserve">consider viewpoints through both stance and underlying logic in search results. We will apply that distinction to short videos, where roles, incomplete context and repeated stories make classification harder.</w:t>
+        <w:t xml:space="preserve">consider stance and underlying logic in search results. This supports examining reasons as well as positions, with additional challenges from roles and incomplete context in short videos.</w:t>
       </w:r>
     </w:p>
     <w:p>
@@ -2202,7 +2214,7 @@
           <w:bCs/>
           <w:b/>
         </w:rPr>
-        <w:t xml:space="preserve">User control already has established approaches.</w:t>
+        <w:t xml:space="preserve">Control and its persistence are already studied.</w:t>
       </w:r>
       <w:r>
         <w:t xml:space="preserve"> </w:t>
@@ -2225,10 +2237,7 @@
         <w:t xml:space="preserve"> </w:t>
       </w:r>
       <w:r>
-        <w:t xml:space="preserve">allows users to influence recommendation through feature-level controls. Our setting differs because users generally cannot modify the platform’s model. We ask how they can express a more specific goal—keep following an issue while reducing unwanted claims or exploring missing reasons—and pursue it through available actions. X’s public recommendation code</w:t>
-      </w:r>
-      <w:r>
-        <w:t xml:space="preserve"> </w:t>
+        <w:t xml:space="preserve">offers feature-level recommendation controls. Using controlled TikTok accounts, Kaplan et al. </w:t>
       </w:r>
       <w:hyperlink w:anchor="ref-6">
         <w:r>
@@ -2242,26 +2251,25 @@
         <w:t xml:space="preserve"> </w:t>
       </w:r>
       <w:r>
-        <w:t xml:space="preserve">provides inspectable examples of filtering and scoring mechanisms, although it does not establish how Chinese short-video platforms respond.</w:t>
-      </w:r>
-    </w:p>
-    <w:p>
-      <w:pPr>
-        <w:pStyle w:val="BodyText"/>
-        <w:widowControl/>
-      </w:pPr>
-      <w:r>
-        <w:rPr>
-          <w:bCs/>
-          <w:b/>
-        </w:rPr>
-        <w:t xml:space="preserve">Public data and simulation make parts of the study feasible.</w:t>
-      </w:r>
-      <w:r>
-        <w:t xml:space="preserve"> </w:t>
-      </w:r>
-      <w:r>
-        <w:t xml:space="preserve">Shang et al.’s ShortVideo dataset</w:t>
+        <w:t xml:space="preserve">compare skipping with</w:t>
+      </w:r>
+      <w:r>
+        <w:t xml:space="preserve"> </w:t>
+      </w:r>
+      <w:r>
+        <w:t xml:space="preserve">“</w:t>
+      </w:r>
+      <w:r>
+        <w:t xml:space="preserve">not interested</w:t>
+      </w:r>
+      <w:r>
+        <w:t xml:space="preserve">”</w:t>
+      </w:r>
+      <w:r>
+        <w:t xml:space="preserve"> </w:t>
+      </w:r>
+      <w:r>
+        <w:t xml:space="preserve">and test recurrence when accounts resume watching the target topic. Compass</w:t>
       </w:r>
       <w:r>
         <w:t xml:space="preserve"> </w:t>
@@ -2278,7 +2286,7 @@
         <w:t xml:space="preserve"> </w:t>
       </w:r>
       <w:r>
-        <w:t xml:space="preserve">links content and user behaviour, while KuaiRand</w:t>
+        <w:t xml:space="preserve">supports reflective preference refinement on YouTube Shorts, combining simulated engagement with direct filtering and supplementation; its field study involved 15 users over ten days. We can build on these approaches. Our focus is the joint evaluation of exposure to claims and reasons, information retention and maintenance effort within an issue the user still follows. X’s public code</w:t>
       </w:r>
       <w:r>
         <w:t xml:space="preserve"> </w:t>
@@ -2295,7 +2303,26 @@
         <w:t xml:space="preserve"> </w:t>
       </w:r>
       <w:r>
-        <w:t xml:space="preserve">provides sequential interactions and randomly exposed videos. They offer material for content analysis and behavioural checks, but do not record users’ reflective goals. SimTok</w:t>
+        <w:t xml:space="preserve">supplies inspectable filtering and scoring mechanisms, not evidence of Chinese platforms’ rules.</w:t>
+      </w:r>
+    </w:p>
+    <w:p>
+      <w:pPr>
+        <w:pStyle w:val="BodyText"/>
+        <w:widowControl/>
+      </w:pPr>
+      <w:r>
+        <w:rPr>
+          <w:bCs/>
+          <w:b/>
+        </w:rPr>
+        <w:t xml:space="preserve">Data and simulation support partial validation.</w:t>
+      </w:r>
+      <w:r>
+        <w:t xml:space="preserve"> </w:t>
+      </w:r>
+      <w:r>
+        <w:t xml:space="preserve">ShortVideo</w:t>
       </w:r>
       <w:r>
         <w:t xml:space="preserve"> </w:t>
@@ -2312,7 +2339,10 @@
         <w:t xml:space="preserve"> </w:t>
       </w:r>
       <w:r>
-        <w:t xml:space="preserve">demonstrates a recommendation loop with LLM users receiving textual video descriptions. Yoon et al. </w:t>
+        <w:t xml:space="preserve">links content and behaviour; KuaiRand</w:t>
+      </w:r>
+      <w:r>
+        <w:t xml:space="preserve"> </w:t>
       </w:r>
       <w:hyperlink w:anchor="ref-10">
         <w:r>
@@ -2326,7 +2356,38 @@
         <w:t xml:space="preserve"> </w:t>
       </w:r>
       <w:r>
-        <w:t xml:space="preserve">show why simulated preferences and feedback must be checked against human data. We will therefore evaluate the user model separately from the intervention.</w:t>
+        <w:t xml:space="preserve">provides interaction sequences and randomly exposed videos. Neither records reflective goals. SimTok</w:t>
+      </w:r>
+      <w:r>
+        <w:t xml:space="preserve"> </w:t>
+      </w:r>
+      <w:hyperlink w:anchor="ref-11">
+        <w:r>
+          <w:rPr>
+            <w:rStyle w:val="Hyperlink"/>
+          </w:rPr>
+          <w:t xml:space="preserve">[11]</w:t>
+        </w:r>
+      </w:hyperlink>
+      <w:r>
+        <w:t xml:space="preserve"> </w:t>
+      </w:r>
+      <w:r>
+        <w:t xml:space="preserve">demonstrates a recommendation loop with LLM users reading video descriptions. Yoon et al. </w:t>
+      </w:r>
+      <w:hyperlink w:anchor="ref-12">
+        <w:r>
+          <w:rPr>
+            <w:rStyle w:val="Hyperlink"/>
+          </w:rPr>
+          <w:t xml:space="preserve">[12]</w:t>
+        </w:r>
+      </w:hyperlink>
+      <w:r>
+        <w:t xml:space="preserve"> </w:t>
+      </w:r>
+      <w:r>
+        <w:t xml:space="preserve">evaluate simulated preferences and feedback against human data, supporting separate evaluation of our user model. Platform audits inform experimental conditions, rather than supplying directly transferable effect sizes.</w:t>
       </w:r>
     </w:p>
     <w:p>
@@ -2335,7 +2396,7 @@
         <w:widowControl/>
       </w:pPr>
       <w:r>
-        <w:t xml:space="preserve">Together, these studies leave a practical question for our project:</w:t>
+        <w:t xml:space="preserve">Our research question brings these strands together:</w:t>
       </w:r>
       <w:r>
         <w:t xml:space="preserve"> </w:t>
@@ -2345,13 +2406,13 @@
           <w:bCs/>
           <w:b/>
         </w:rPr>
-        <w:t xml:space="preserve">can a user-facing approach identify repeated reasons within everyday issues, translate a specific adjustment goal into available actions, and compare the resulting information loss and maintenance effort?</w:t>
-      </w:r>
-      <w:r>
-        <w:t xml:space="preserve"> </w:t>
-      </w:r>
-      <w:r>
-        <w:t xml:space="preserve">Our contribution is to investigate this question across several issues under imperfect content understanding and limited platform access, rather than invent a new recommendation algorithm.</w:t>
+        <w:t xml:space="preserve">can users reduce a particular claim or explore missing reasons while retaining useful content on the same issue, and what effort does this require?</w:t>
+      </w:r>
+      <w:r>
+        <w:t xml:space="preserve"> </w:t>
+      </w:r>
+      <w:r>
+        <w:t xml:space="preserve">We investigate this across issues under imperfect content understanding and limited platform access. Our contribution is an evidence-based evaluation of this combined problem.</w:t>
       </w:r>
     </w:p>
     <w:bookmarkEnd w:id="25"/>
@@ -2371,7 +2432,7 @@
         <w:widowControl/>
       </w:pPr>
       <w:r>
-        <w:t xml:space="preserve">We have obtained public short-video content and interaction datasets, checked video–transcript pairs, and run initial retrieval and response-model checks. These establish access and execution, not accuracy or simulation realism.</w:t>
+        <w:t xml:space="preserve">We need interpretable content and interaction histories. We have obtained ShortVideo samples and KuaiRand-1K/Pure logs with supplementary captions and categories. Eight ShortVideo video–transcript pairs were retrieved and the videos decoded; pretrained semantic retrieval and an untrained user-response network also ran. These checks establish access and execution, not transcription accuracy, model validity or complete feed coverage.</w:t>
       </w:r>
     </w:p>
     <w:p>
@@ -2380,7 +2441,7 @@
         <w:widowControl/>
       </w:pPr>
       <w:r>
-        <w:t xml:space="preserve">Pilot annotation will guide sample selection to cover important cases and assess errors. We will reuse pretrained models and established statistical methods. Large-model inference requires suitable computing resources; if these are unavailable or ineffective, we can still analyse manually checked content and demonstrate the proposed control logic in a transparent simulation. The report will state which components were implemented and which remain designs.</w:t>
+        <w:t xml:space="preserve">Next, pilot retrieval and independent annotation will guide issue selection, sample size and error analysis. We will benchmark pretrained LLM/VLM content analysis and rule-based, learned and LLM-based users, measuring resource use on small batches before scaling. If a component fails validation or exceeds available resources, we will use manually checked content or a transparent rule-based simulation, and state the resulting limits. The report will distinguish implemented, validated and proposed components.</w:t>
       </w:r>
     </w:p>
     <w:p>
@@ -2389,7 +2450,7 @@
         <w:widowControl/>
       </w:pPr>
       <w:r>
-        <w:t xml:space="preserve">The main limitations are incomplete video context, sparse personal histories and unknown platform responses. Observational changes after negative feedback will be reported as associations, not causal effects. Simulation results will remain conditional on their assumptions. Independently checked labels will be used where available to assess whether measurement errors make an intervention look better than it is. Broader exposure does not prove better judgement, and removing disliked views can itself narrow a feed. We will make those trade-offs visible and avoid treating opposing claims as equally credible when their evidence differs.</w:t>
+        <w:t xml:space="preserve">Incomplete context or ambiguous speech will receive unknown labels; visual checks and alternative plausible labels will test their effect. History coverage and uncertainty will determine whether an issue-level report is supportable. Unknown platform responses require sensitivity experiments. Negative-feedback associations are not causal effects, and simulated improvements do not establish live-platform or belief changes. Broader exposure does not prove better judgement; selective filtering may narrow a feed further. We will expose these trade-offs and preserve distinctions in evidence quality.</w:t>
       </w:r>
     </w:p>
     <w:p>
@@ -2398,7 +2459,7 @@
         <w:widowControl/>
       </w:pPr>
       <w:r>
-        <w:t xml:space="preserve">The core work uses publicly released research data and simulated users. Offline adjustment goals will be specified as test scenarios, not inferred as the wishes of people in anonymous logs. We will follow dataset terms, avoid identifying individuals, and keep unnecessary personal details out of examples and shared outputs. Any external AI processing must respect the source’s permitted use and avoid sending identifiable histories. Human testing is optional; before recruitment, we would confirm applicable course or university requirements and obtain informed consent. No live account automation or platform intervention is needed for the core study.</w:t>
+        <w:t xml:space="preserve">The core uses released research data and simulated users. Goals are explicit test scenarios, not inferred wishes of people in anonymous logs. We will follow data terms, avoid re-identification, minimise personal details and avoid uploading individual viewing histories to external AI services. Public video material will be checked for permitted use and personal information before external processing. Annotators may skip distressing content. Optional human testing requires informed consent and confirmation of applicable course or university requirements; core experiments are offline.</w:t>
       </w:r>
     </w:p>
     <w:bookmarkEnd w:id="26"/>
@@ -2415,6 +2476,7 @@
     <w:p>
       <w:pPr>
         <w:pStyle w:val="FirstParagraph"/>
+        <w:keepNext/>
         <w:widowControl/>
       </w:pPr>
       <w:r>
@@ -2425,14 +2487,20 @@
       <w:tblPr>
         <w:tblStyle w:val="SubmissionGrid"/>
         <w:tblW w:type="pct" w:w="5000"/>
-        <w:tblLayout w:type="fixed"/>
         <w:tblLook w:firstRow="1" w:lastRow="0" w:firstColumn="0" w:lastColumn="0" w:noHBand="0" w:noVBand="0" w:val="0020"/>
         <w:jc w:val="start"/>
+        <w:tblLayout w:type="fixed"/>
+        <w:tblCellMar>
+          <w:top w:w="40" w:type="dxa"/>
+          <w:bottom w:w="40" w:type="dxa"/>
+          <w:left w:w="70" w:type="dxa"/>
+          <w:right w:w="70" w:type="dxa"/>
+        </w:tblCellMar>
       </w:tblPr>
       <w:tblGrid>
-        <w:gridCol w:w="1728"/>
-        <w:gridCol w:w="5976"/>
-        <w:gridCol w:w="1757"/>
+        <w:gridCol w:w="1584"/>
+        <w:gridCol w:w="5501"/>
+        <w:gridCol w:w="2376"/>
       </w:tblGrid>
       <w:tr>
         <w:trPr>
@@ -2442,12 +2510,13 @@
         </w:trPr>
         <w:tc>
           <w:tcPr>
-            <w:tcW w:type="dxa" w:w="1728"/>
+            <w:tcW w:type="dxa" w:w="1584"/>
           </w:tcPr>
           <w:p>
             <w:pPr>
               <w:pStyle w:val="Compact"/>
-              <w:spacing w:after="60" w:before="60" w:line="259" w:lineRule="auto"/>
+              <w:keepNext/>
+              <w:spacing w:after="0" w:before="0" w:line="259" w:lineRule="auto"/>
               <w:jc w:val="left"/>
             </w:pPr>
             <w:r>
@@ -2461,12 +2530,13 @@
         </w:tc>
         <w:tc>
           <w:tcPr>
-            <w:tcW w:type="dxa" w:w="5976"/>
+            <w:tcW w:type="dxa" w:w="5501"/>
           </w:tcPr>
           <w:p>
             <w:pPr>
               <w:pStyle w:val="Compact"/>
-              <w:spacing w:after="60" w:before="60" w:line="259" w:lineRule="auto"/>
+              <w:keepNext/>
+              <w:spacing w:after="0" w:before="0" w:line="259" w:lineRule="auto"/>
               <w:jc w:val="left"/>
             </w:pPr>
             <w:r>
@@ -2480,12 +2550,13 @@
         </w:tc>
         <w:tc>
           <w:tcPr>
-            <w:tcW w:type="dxa" w:w="1757"/>
+            <w:tcW w:type="dxa" w:w="2376"/>
           </w:tcPr>
           <w:p>
             <w:pPr>
               <w:pStyle w:val="Compact"/>
-              <w:spacing w:after="60" w:before="60" w:line="259" w:lineRule="auto"/>
+              <w:keepNext/>
+              <w:spacing w:after="0" w:before="0" w:line="259" w:lineRule="auto"/>
               <w:jc w:val="left"/>
             </w:pPr>
             <w:r>
@@ -2504,71 +2575,13 @@
         </w:trPr>
         <w:tc>
           <w:tcPr>
-            <w:tcW w:type="dxa" w:w="1728"/>
+            <w:tcW w:type="dxa" w:w="1584"/>
           </w:tcPr>
           <w:p>
             <w:pPr>
               <w:pStyle w:val="Compact"/>
-              <w:spacing w:after="60" w:before="60" w:line="259" w:lineRule="auto"/>
-              <w:jc w:val="left"/>
-            </w:pPr>
-            <w:r>
-              <w:rPr>
-                <w:sz w:val="20"/>
-              </w:rPr>
-              <w:t xml:space="preserve">4 Oct</w:t>
-            </w:r>
-          </w:p>
-        </w:tc>
-        <w:tc>
-          <w:tcPr>
-            <w:tcW w:type="dxa" w:w="5976"/>
-          </w:tcPr>
-          <w:p>
-            <w:pPr>
-              <w:pStyle w:val="Compact"/>
-              <w:spacing w:after="60" w:before="60" w:line="259" w:lineRule="auto"/>
-              <w:jc w:val="left"/>
-            </w:pPr>
-            <w:r>
-              <w:rPr>
-                <w:sz w:val="20"/>
-              </w:rPr>
-              <w:t xml:space="preserve">Submit plan; confirm question and responsibilities</w:t>
-            </w:r>
-          </w:p>
-        </w:tc>
-        <w:tc>
-          <w:tcPr>
-            <w:tcW w:type="dxa" w:w="1757"/>
-          </w:tcPr>
-          <w:p>
-            <w:pPr>
-              <w:pStyle w:val="Compact"/>
-              <w:spacing w:after="60" w:before="60" w:line="259" w:lineRule="auto"/>
-              <w:jc w:val="left"/>
-            </w:pPr>
-            <w:r>
-              <w:rPr>
-                <w:sz w:val="20"/>
-              </w:rPr>
-              <w:t>Li Yitong; all</w:t>
-            </w:r>
-          </w:p>
-        </w:tc>
-      </w:tr>
-      <w:tr>
-        <w:trPr>
-          <w:cantSplit/>
-        </w:trPr>
-        <w:tc>
-          <w:tcPr>
-            <w:tcW w:type="dxa" w:w="1728"/>
-          </w:tcPr>
-          <w:p>
-            <w:pPr>
-              <w:pStyle w:val="Compact"/>
-              <w:spacing w:after="60" w:before="60" w:line="259" w:lineRule="auto"/>
+              <w:keepNext/>
+              <w:spacing w:after="0" w:before="0" w:line="259" w:lineRule="auto"/>
               <w:jc w:val="left"/>
             </w:pPr>
             <w:r>
@@ -2581,37 +2594,39 @@
         </w:tc>
         <w:tc>
           <w:tcPr>
-            <w:tcW w:type="dxa" w:w="5976"/>
+            <w:tcW w:type="dxa" w:w="5501"/>
           </w:tcPr>
           <w:p>
             <w:pPr>
               <w:pStyle w:val="Compact"/>
-              <w:spacing w:after="60" w:before="60" w:line="259" w:lineRule="auto"/>
+              <w:keepNext/>
+              <w:spacing w:after="0" w:before="0" w:line="259" w:lineRule="auto"/>
               <w:jc w:val="left"/>
             </w:pPr>
             <w:r>
               <w:rPr>
                 <w:sz w:val="20"/>
               </w:rPr>
-              <w:t xml:space="preserve">Select issues, inspect data, pilot labels and freeze evaluation approach</w:t>
+              <w:t xml:space="preserve">Select issues, inspect data, pilot independent labels and freeze evaluation approach</w:t>
             </w:r>
           </w:p>
         </w:tc>
         <w:tc>
           <w:tcPr>
-            <w:tcW w:type="dxa" w:w="1757"/>
+            <w:tcW w:type="dxa" w:w="2376"/>
           </w:tcPr>
           <w:p>
             <w:pPr>
               <w:pStyle w:val="Compact"/>
-              <w:spacing w:after="60" w:before="60" w:line="259" w:lineRule="auto"/>
+              <w:keepNext/>
+              <w:spacing w:after="0" w:before="0" w:line="259" w:lineRule="auto"/>
               <w:jc w:val="left"/>
             </w:pPr>
             <w:r>
               <w:rPr>
                 <w:sz w:val="20"/>
               </w:rPr>
-              <w:t>Fu Yitong, Xu Ruicong, Zhao Dingcheng</w:t>
+              <w:t>Fu Yitong, Wang Junbo</w:t>
             </w:r>
           </w:p>
         </w:tc>
@@ -2622,12 +2637,13 @@
         </w:trPr>
         <w:tc>
           <w:tcPr>
-            <w:tcW w:type="dxa" w:w="1728"/>
+            <w:tcW w:type="dxa" w:w="1584"/>
           </w:tcPr>
           <w:p>
             <w:pPr>
               <w:pStyle w:val="Compact"/>
-              <w:spacing w:after="60" w:before="60" w:line="259" w:lineRule="auto"/>
+              <w:keepNext/>
+              <w:spacing w:after="0" w:before="0" w:line="259" w:lineRule="auto"/>
               <w:jc w:val="left"/>
             </w:pPr>
             <w:r>
@@ -2640,12 +2656,13 @@
         </w:tc>
         <w:tc>
           <w:tcPr>
-            <w:tcW w:type="dxa" w:w="5976"/>
+            <w:tcW w:type="dxa" w:w="5501"/>
           </w:tcPr>
           <w:p>
             <w:pPr>
               <w:pStyle w:val="Compact"/>
-              <w:spacing w:after="60" w:before="60" w:line="259" w:lineRule="auto"/>
+              <w:keepNext/>
+              <w:spacing w:after="0" w:before="0" w:line="259" w:lineRule="auto"/>
               <w:jc w:val="left"/>
             </w:pPr>
             <w:r>
@@ -2658,12 +2675,13 @@
         </w:tc>
         <w:tc>
           <w:tcPr>
-            <w:tcW w:type="dxa" w:w="1757"/>
+            <w:tcW w:type="dxa" w:w="2376"/>
           </w:tcPr>
           <w:p>
             <w:pPr>
               <w:pStyle w:val="Compact"/>
-              <w:spacing w:after="60" w:before="60" w:line="259" w:lineRule="auto"/>
+              <w:keepNext/>
+              <w:spacing w:after="0" w:before="0" w:line="259" w:lineRule="auto"/>
               <w:jc w:val="left"/>
             </w:pPr>
             <w:r>
@@ -2681,12 +2699,13 @@
         </w:trPr>
         <w:tc>
           <w:tcPr>
-            <w:tcW w:type="dxa" w:w="1728"/>
+            <w:tcW w:type="dxa" w:w="1584"/>
           </w:tcPr>
           <w:p>
             <w:pPr>
               <w:pStyle w:val="Compact"/>
-              <w:spacing w:after="60" w:before="60" w:line="259" w:lineRule="auto"/>
+              <w:keepNext/>
+              <w:spacing w:after="0" w:before="0" w:line="259" w:lineRule="auto"/>
               <w:jc w:val="left"/>
             </w:pPr>
             <w:r>
@@ -2699,30 +2718,32 @@
         </w:tc>
         <w:tc>
           <w:tcPr>
-            <w:tcW w:type="dxa" w:w="5976"/>
+            <w:tcW w:type="dxa" w:w="5501"/>
           </w:tcPr>
           <w:p>
             <w:pPr>
               <w:pStyle w:val="Compact"/>
-              <w:spacing w:after="60" w:before="60" w:line="259" w:lineRule="auto"/>
+              <w:keepNext/>
+              <w:spacing w:after="0" w:before="0" w:line="259" w:lineRule="auto"/>
               <w:jc w:val="left"/>
             </w:pPr>
             <w:r>
               <w:rPr>
                 <w:sz w:val="20"/>
               </w:rPr>
-              <w:t xml:space="preserve">Prepare a worked example and initial simulation for the interim meeting</w:t>
+              <w:t xml:space="preserve">Worked example and initial simulation ready by 19 Oct; interim meeting 20–24 Oct</w:t>
             </w:r>
           </w:p>
         </w:tc>
         <w:tc>
           <w:tcPr>
-            <w:tcW w:type="dxa" w:w="1757"/>
+            <w:tcW w:type="dxa" w:w="2376"/>
           </w:tcPr>
           <w:p>
             <w:pPr>
               <w:pStyle w:val="Compact"/>
-              <w:spacing w:after="60" w:before="60" w:line="259" w:lineRule="auto"/>
+              <w:keepNext/>
+              <w:spacing w:after="0" w:before="0" w:line="259" w:lineRule="auto"/>
               <w:jc w:val="left"/>
             </w:pPr>
             <w:r>
@@ -2740,12 +2761,13 @@
         </w:trPr>
         <w:tc>
           <w:tcPr>
-            <w:tcW w:type="dxa" w:w="1728"/>
+            <w:tcW w:type="dxa" w:w="1584"/>
           </w:tcPr>
           <w:p>
             <w:pPr>
               <w:pStyle w:val="Compact"/>
-              <w:spacing w:after="60" w:before="60" w:line="259" w:lineRule="auto"/>
+              <w:keepNext/>
+              <w:spacing w:after="0" w:before="0" w:line="259" w:lineRule="auto"/>
               <w:jc w:val="left"/>
             </w:pPr>
             <w:r>
@@ -2758,12 +2780,13 @@
         </w:tc>
         <w:tc>
           <w:tcPr>
-            <w:tcW w:type="dxa" w:w="5976"/>
+            <w:tcW w:type="dxa" w:w="5501"/>
           </w:tcPr>
           <w:p>
             <w:pPr>
               <w:pStyle w:val="Compact"/>
-              <w:spacing w:after="60" w:before="60" w:line="259" w:lineRule="auto"/>
+              <w:keepNext/>
+              <w:spacing w:after="0" w:before="0" w:line="259" w:lineRule="auto"/>
               <w:jc w:val="left"/>
             </w:pPr>
             <w:r>
@@ -2776,12 +2799,13 @@
         </w:tc>
         <w:tc>
           <w:tcPr>
-            <w:tcW w:type="dxa" w:w="1757"/>
+            <w:tcW w:type="dxa" w:w="2376"/>
           </w:tcPr>
           <w:p>
             <w:pPr>
               <w:pStyle w:val="Compact"/>
-              <w:spacing w:after="60" w:before="60" w:line="259" w:lineRule="auto"/>
+              <w:keepNext/>
+              <w:spacing w:after="0" w:before="0" w:line="259" w:lineRule="auto"/>
               <w:jc w:val="left"/>
             </w:pPr>
             <w:r>
@@ -2799,12 +2823,13 @@
         </w:trPr>
         <w:tc>
           <w:tcPr>
-            <w:tcW w:type="dxa" w:w="1728"/>
+            <w:tcW w:type="dxa" w:w="1584"/>
           </w:tcPr>
           <w:p>
             <w:pPr>
               <w:pStyle w:val="Compact"/>
-              <w:spacing w:after="60" w:before="60" w:line="259" w:lineRule="auto"/>
+              <w:keepNext/>
+              <w:spacing w:after="0" w:before="0" w:line="259" w:lineRule="auto"/>
               <w:jc w:val="left"/>
             </w:pPr>
             <w:r>
@@ -2817,12 +2842,13 @@
         </w:tc>
         <w:tc>
           <w:tcPr>
-            <w:tcW w:type="dxa" w:w="5976"/>
+            <w:tcW w:type="dxa" w:w="5501"/>
           </w:tcPr>
           <w:p>
             <w:pPr>
               <w:pStyle w:val="Compact"/>
-              <w:spacing w:after="60" w:before="60" w:line="259" w:lineRule="auto"/>
+              <w:keepNext/>
+              <w:spacing w:after="0" w:before="0" w:line="259" w:lineRule="auto"/>
               <w:jc w:val="left"/>
             </w:pPr>
             <w:r>
@@ -2835,12 +2861,13 @@
         </w:tc>
         <w:tc>
           <w:tcPr>
-            <w:tcW w:type="dxa" w:w="1757"/>
+            <w:tcW w:type="dxa" w:w="2376"/>
           </w:tcPr>
           <w:p>
             <w:pPr>
               <w:pStyle w:val="Compact"/>
-              <w:spacing w:after="60" w:before="60" w:line="259" w:lineRule="auto"/>
+              <w:keepNext/>
+              <w:spacing w:after="0" w:before="0" w:line="259" w:lineRule="auto"/>
               <w:jc w:val="left"/>
             </w:pPr>
             <w:r>
@@ -2858,12 +2885,13 @@
         </w:trPr>
         <w:tc>
           <w:tcPr>
-            <w:tcW w:type="dxa" w:w="1728"/>
+            <w:tcW w:type="dxa" w:w="1584"/>
           </w:tcPr>
           <w:p>
             <w:pPr>
               <w:pStyle w:val="Compact"/>
-              <w:spacing w:after="60" w:before="60" w:line="259" w:lineRule="auto"/>
+              <w:keepNext/>
+              <w:spacing w:after="0" w:before="0" w:line="259" w:lineRule="auto"/>
               <w:jc w:val="left"/>
             </w:pPr>
             <w:r>
@@ -2876,12 +2904,13 @@
         </w:tc>
         <w:tc>
           <w:tcPr>
-            <w:tcW w:type="dxa" w:w="5976"/>
+            <w:tcW w:type="dxa" w:w="5501"/>
           </w:tcPr>
           <w:p>
             <w:pPr>
               <w:pStyle w:val="Compact"/>
-              <w:spacing w:after="60" w:before="60" w:line="259" w:lineRule="auto"/>
+              <w:keepNext/>
+              <w:spacing w:after="0" w:before="0" w:line="259" w:lineRule="auto"/>
               <w:jc w:val="left"/>
             </w:pPr>
             <w:r>
@@ -2894,12 +2923,13 @@
         </w:tc>
         <w:tc>
           <w:tcPr>
-            <w:tcW w:type="dxa" w:w="1757"/>
+            <w:tcW w:type="dxa" w:w="2376"/>
           </w:tcPr>
           <w:p>
             <w:pPr>
               <w:pStyle w:val="Compact"/>
-              <w:spacing w:after="60" w:before="60" w:line="259" w:lineRule="auto"/>
+              <w:keepNext/>
+              <w:spacing w:after="0" w:before="0" w:line="259" w:lineRule="auto"/>
               <w:jc w:val="left"/>
             </w:pPr>
             <w:r>
@@ -2917,12 +2947,13 @@
         </w:trPr>
         <w:tc>
           <w:tcPr>
-            <w:tcW w:type="dxa" w:w="1728"/>
+            <w:tcW w:type="dxa" w:w="1584"/>
           </w:tcPr>
           <w:p>
             <w:pPr>
               <w:pStyle w:val="Compact"/>
-              <w:spacing w:after="60" w:before="60" w:line="259" w:lineRule="auto"/>
+              <w:keepNext w:val="0"/>
+              <w:spacing w:after="0" w:before="0" w:line="259" w:lineRule="auto"/>
               <w:jc w:val="left"/>
             </w:pPr>
             <w:r>
@@ -2935,12 +2966,13 @@
         </w:tc>
         <w:tc>
           <w:tcPr>
-            <w:tcW w:type="dxa" w:w="5976"/>
+            <w:tcW w:type="dxa" w:w="5501"/>
           </w:tcPr>
           <w:p>
             <w:pPr>
               <w:pStyle w:val="Compact"/>
-              <w:spacing w:after="60" w:before="60" w:line="259" w:lineRule="auto"/>
+              <w:keepNext w:val="0"/>
+              <w:spacing w:after="0" w:before="0" w:line="259" w:lineRule="auto"/>
               <w:jc w:val="left"/>
             </w:pPr>
             <w:r>
@@ -2953,12 +2985,13 @@
         </w:tc>
         <w:tc>
           <w:tcPr>
-            <w:tcW w:type="dxa" w:w="1757"/>
+            <w:tcW w:type="dxa" w:w="2376"/>
           </w:tcPr>
           <w:p>
             <w:pPr>
               <w:pStyle w:val="Compact"/>
-              <w:spacing w:after="60" w:before="60" w:line="259" w:lineRule="auto"/>
+              <w:keepNext w:val="0"/>
+              <w:spacing w:after="0" w:before="0" w:line="259" w:lineRule="auto"/>
               <w:jc w:val="left"/>
             </w:pPr>
             <w:r>
@@ -2980,9 +3013,15 @@
       <w:tblPr>
         <w:tblStyle w:val="SubmissionGrid"/>
         <w:tblW w:type="pct" w:w="5000"/>
-        <w:tblLayout w:type="fixed"/>
         <w:tblLook w:firstRow="1" w:lastRow="0" w:firstColumn="0" w:lastColumn="0" w:noHBand="0" w:noVBand="0" w:val="0020"/>
         <w:jc w:val="start"/>
+        <w:tblLayout w:type="fixed"/>
+        <w:tblCellMar>
+          <w:top w:w="40" w:type="dxa"/>
+          <w:bottom w:w="40" w:type="dxa"/>
+          <w:left w:w="70" w:type="dxa"/>
+          <w:right w:w="70" w:type="dxa"/>
+        </w:tblCellMar>
       </w:tblPr>
       <w:tblGrid>
         <w:gridCol w:w="1757"/>
@@ -3001,7 +3040,7 @@
           <w:p>
             <w:pPr>
               <w:pStyle w:val="Compact"/>
-              <w:spacing w:after="60" w:before="60" w:line="259" w:lineRule="auto"/>
+              <w:spacing w:after="0" w:before="0" w:line="259" w:lineRule="auto"/>
               <w:jc w:val="left"/>
             </w:pPr>
             <w:r>
@@ -3020,7 +3059,7 @@
           <w:p>
             <w:pPr>
               <w:pStyle w:val="Compact"/>
-              <w:spacing w:after="60" w:before="60" w:line="259" w:lineRule="auto"/>
+              <w:spacing w:after="0" w:before="0" w:line="259" w:lineRule="auto"/>
               <w:jc w:val="left"/>
             </w:pPr>
             <w:r>
@@ -3044,7 +3083,7 @@
           <w:p>
             <w:pPr>
               <w:pStyle w:val="Compact"/>
-              <w:spacing w:after="60" w:before="60" w:line="259" w:lineRule="auto"/>
+              <w:spacing w:after="0" w:before="0" w:line="259" w:lineRule="auto"/>
               <w:jc w:val="left"/>
             </w:pPr>
             <w:r>
@@ -3062,14 +3101,14 @@
           <w:p>
             <w:pPr>
               <w:pStyle w:val="Compact"/>
-              <w:spacing w:after="60" w:before="60" w:line="259" w:lineRule="auto"/>
+              <w:spacing w:after="0" w:before="0" w:line="259" w:lineRule="auto"/>
               <w:jc w:val="left"/>
             </w:pPr>
             <w:r>
               <w:rPr>
                 <w:sz w:val="20"/>
               </w:rPr>
-              <w:t xml:space="preserve">Problem definition, literature synthesis, viewpoint annotation and interpretation of content errors</w:t>
+              <w:t xml:space="preserve">Problem definition, literature synthesis, viewpoint annotation and error analysis</w:t>
             </w:r>
           </w:p>
         </w:tc>
@@ -3085,7 +3124,7 @@
           <w:p>
             <w:pPr>
               <w:pStyle w:val="Compact"/>
-              <w:spacing w:after="60" w:before="60" w:line="259" w:lineRule="auto"/>
+              <w:spacing w:after="0" w:before="0" w:line="259" w:lineRule="auto"/>
               <w:jc w:val="left"/>
             </w:pPr>
             <w:r>
@@ -3103,7 +3142,7 @@
           <w:p>
             <w:pPr>
               <w:pStyle w:val="Compact"/>
-              <w:spacing w:after="60" w:before="60" w:line="259" w:lineRule="auto"/>
+              <w:spacing w:after="0" w:before="0" w:line="259" w:lineRule="auto"/>
               <w:jc w:val="left"/>
             </w:pPr>
             <w:r>
@@ -3126,7 +3165,7 @@
           <w:p>
             <w:pPr>
               <w:pStyle w:val="Compact"/>
-              <w:spacing w:after="60" w:before="60" w:line="259" w:lineRule="auto"/>
+              <w:spacing w:after="0" w:before="0" w:line="259" w:lineRule="auto"/>
               <w:jc w:val="left"/>
             </w:pPr>
             <w:r>
@@ -3144,14 +3183,14 @@
           <w:p>
             <w:pPr>
               <w:pStyle w:val="Compact"/>
-              <w:spacing w:after="60" w:before="60" w:line="259" w:lineRule="auto"/>
+              <w:spacing w:after="0" w:before="0" w:line="259" w:lineRule="auto"/>
               <w:jc w:val="left"/>
             </w:pPr>
             <w:r>
               <w:rPr>
                 <w:sz w:val="20"/>
               </w:rPr>
-              <w:t xml:space="preserve">User adjustment goals, exposure report and control-flow design, independent annotation and report editing</w:t>
+              <w:t xml:space="preserve">User goals, exposure report and control design, independent annotation, report editing</w:t>
             </w:r>
           </w:p>
         </w:tc>
@@ -3167,7 +3206,7 @@
           <w:p>
             <w:pPr>
               <w:pStyle w:val="Compact"/>
-              <w:spacing w:after="60" w:before="60" w:line="259" w:lineRule="auto"/>
+              <w:spacing w:after="0" w:before="0" w:line="259" w:lineRule="auto"/>
               <w:jc w:val="left"/>
             </w:pPr>
             <w:r>
@@ -3185,7 +3224,7 @@
           <w:p>
             <w:pPr>
               <w:pStyle w:val="Compact"/>
-              <w:spacing w:after="60" w:before="60" w:line="259" w:lineRule="auto"/>
+              <w:spacing w:after="0" w:before="0" w:line="259" w:lineRule="auto"/>
               <w:jc w:val="left"/>
             </w:pPr>
             <w:r>
@@ -3208,7 +3247,7 @@
           <w:p>
             <w:pPr>
               <w:pStyle w:val="Compact"/>
-              <w:spacing w:after="60" w:before="60" w:line="259" w:lineRule="auto"/>
+              <w:spacing w:after="0" w:before="0" w:line="259" w:lineRule="auto"/>
               <w:jc w:val="left"/>
             </w:pPr>
             <w:r>
@@ -3226,14 +3265,14 @@
           <w:p>
             <w:pPr>
               <w:pStyle w:val="Compact"/>
-              <w:spacing w:after="60" w:before="60" w:line="259" w:lineRule="auto"/>
+              <w:spacing w:after="0" w:before="0" w:line="259" w:lineRule="auto"/>
               <w:jc w:val="left"/>
             </w:pPr>
             <w:r>
               <w:rPr>
                 <w:sz w:val="20"/>
               </w:rPr>
-              <w:t xml:space="preserve">Semantic retrieval, LLM/VLM content analysis, evidence checking and cross-issue evaluation</w:t>
+              <w:t xml:space="preserve">Semantic retrieval, LLM/VLM analysis, evidence checking and cross-issue evaluation</w:t>
             </w:r>
           </w:p>
         </w:tc>
@@ -3245,11 +3284,11 @@
         <w:widowControl/>
       </w:pPr>
       <w:r>
-        <w:t xml:space="preserve">Fu Yitong and Wang Junbo will independently annotate the evaluation sample using a protocol developed with Zhao Dingcheng; disagreements will be reviewed together. Each member will write a substantive section and review another’s work. Weekly meetings will track evidence, dependencies and progress.</w:t>
+        <w:t xml:space="preserve">Fu Yitong and Wang Junbo will independently annotate samples under a protocol developed with Zhao Dingcheng, then review disagreements together. Each member will write a substantive section and review another’s. Weekly meetings will track evidence and progress.</w:t>
       </w:r>
     </w:p>
     <w:bookmarkEnd w:id="27"/>
-    <w:bookmarkStart w:id="48" w:name="references"/>
+    <w:bookmarkStart w:id="53" w:name="references"/>
     <w:p>
       <w:pPr>
         <w:pStyle w:val="Heading1"/>
@@ -3285,7 +3324,7 @@
         <w:rPr>
           <w:sz w:val="19"/>
         </w:rPr>
-        <w:t xml:space="preserve">Milli, S., Carroll, M., Wang, Y., Pandey, S., Zhao, S., &amp; Dragan, A. D. (2024).</w:t>
+        <w:t xml:space="preserve">Milli, S., Carroll, M., Wang, Y., Pandey, S., Zhao, S., &amp; Dragan, A. D. (2025).</w:t>
       </w:r>
       <w:r>
         <w:rPr>
@@ -3308,7 +3347,7 @@
         <w:rPr>
           <w:sz w:val="19"/>
         </w:rPr>
-        <w:t xml:space="preserve">. arXiv:2305.16941, version 6.</w:t>
+        <w:t xml:space="preserve">. PNAS Nexus, 4(3), pgaf062.</w:t>
       </w:r>
     </w:p>
     <w:p>
@@ -3493,27 +3532,6 @@
         </w:rPr>
         <w:t xml:space="preserve">. ECIR 2023, pp. 279–297.</w:t>
       </w:r>
-      <w:r>
-        <w:rPr>
-          <w:sz w:val="19"/>
-        </w:rPr>
-        <w:t xml:space="preserve"> </w:t>
-      </w:r>
-      <w:hyperlink r:id="rId35">
-        <w:r>
-          <w:rPr>
-            <w:rStyle w:val="Hyperlink"/>
-            <w:sz w:val="19"/>
-          </w:rPr>
-          <w:t xml:space="preserve">doi:10.1007/978-3-031-28244-7_18</w:t>
-        </w:r>
-      </w:hyperlink>
-      <w:r>
-        <w:rPr>
-          <w:sz w:val="19"/>
-        </w:rPr>
-        <w:t xml:space="preserve">.</w:t>
-      </w:r>
     </w:p>
     <w:p>
       <w:pPr>
@@ -3566,26 +3584,111 @@
         </w:rPr>
         <w:t xml:space="preserve">. SIGIR 2022, pp. 1251–1261.</w:t>
       </w:r>
-      <w:r>
-        <w:rPr>
-          <w:sz w:val="19"/>
-        </w:rPr>
-        <w:t xml:space="preserve"> </w:t>
-      </w:r>
-      <w:hyperlink r:id="rId37">
+    </w:p>
+    <w:p>
+      <w:pPr>
+        <w:pStyle w:val="BodyText"/>
+        <w:keepLines/>
+        <w:widowControl/>
+        <w:spacing w:after="100" w:line="252" w:lineRule="auto"/>
+        <w:ind w:left="400" w:hanging="400"/>
+      </w:pPr>
+      <w:bookmarkStart w:id="38" w:name="ref-6"/>
+      <w:r>
+        <w:rPr>
+          <w:sz w:val="19"/>
+        </w:rPr>
+        <w:t xml:space="preserve">[6]</w:t>
+      </w:r>
+      <w:bookmarkEnd w:id="38"/>
+      <w:r>
+        <w:rPr>
+          <w:sz w:val="19"/>
+        </w:rPr>
+        <w:t xml:space="preserve"> </w:t>
+      </w:r>
+      <w:r>
+        <w:rPr>
+          <w:sz w:val="19"/>
+        </w:rPr>
+        <w:t xml:space="preserve">Kaplan, L., Patel, D., Gerzon, N., Mislove, A., &amp; Sapiezynski, P. (2026).</w:t>
+      </w:r>
+      <w:r>
+        <w:rPr>
+          <w:sz w:val="19"/>
+        </w:rPr>
+        <w:t xml:space="preserve"> </w:t>
+      </w:r>
+      <w:hyperlink r:id="rId39">
         <w:r>
           <w:rPr>
             <w:rStyle w:val="Hyperlink"/>
+            <w:iCs/>
+            <w:i/>
             <w:sz w:val="19"/>
           </w:rPr>
-          <w:t xml:space="preserve">doi:10.1145/3477495.3532075</w:t>
+          <w:t xml:space="preserve">When</w:t>
+        </w:r>
+        <w:r>
+          <w:rPr>
+            <w:rStyle w:val="Hyperlink"/>
+            <w:iCs/>
+            <w:i/>
+            <w:sz w:val="19"/>
+          </w:rPr>
+          <w:t xml:space="preserve"> </w:t>
+        </w:r>
+        <w:r>
+          <w:rPr>
+            <w:rStyle w:val="Hyperlink"/>
+            <w:iCs/>
+            <w:i/>
+            <w:sz w:val="19"/>
+          </w:rPr>
+          <w:t xml:space="preserve">“</w:t>
+        </w:r>
+        <w:r>
+          <w:rPr>
+            <w:rStyle w:val="Hyperlink"/>
+            <w:iCs/>
+            <w:i/>
+            <w:sz w:val="19"/>
+          </w:rPr>
+          <w:t xml:space="preserve">For You</w:t>
+        </w:r>
+        <w:r>
+          <w:rPr>
+            <w:rStyle w:val="Hyperlink"/>
+            <w:iCs/>
+            <w:i/>
+            <w:sz w:val="19"/>
+          </w:rPr>
+          <w:t xml:space="preserve">”</w:t>
+        </w:r>
+        <w:r>
+          <w:rPr>
+            <w:rStyle w:val="Hyperlink"/>
+            <w:iCs/>
+            <w:i/>
+            <w:sz w:val="19"/>
+          </w:rPr>
+          <w:t xml:space="preserve"> </w:t>
+        </w:r>
+        <w:r>
+          <w:rPr>
+            <w:rStyle w:val="Hyperlink"/>
+            <w:iCs/>
+            <w:i/>
+            <w:sz w:val="19"/>
+          </w:rPr>
+          <w:t xml:space="preserve">Isn’t For You: Measuring User Agency in TikTok’s Algorithmic Feed</w:t>
         </w:r>
       </w:hyperlink>
       <w:r>
         <w:rPr>
           <w:sz w:val="19"/>
         </w:rPr>
-        <w:t xml:space="preserve">.</w:t>
+        <w:t xml:space="preserve">. arXiv:2605.10690.</w:t>
       </w:r>
     </w:p>
     <w:p>
@@ -3596,14 +3699,66 @@
         <w:spacing w:after="100" w:line="252" w:lineRule="auto"/>
         <w:ind w:left="400" w:hanging="400"/>
       </w:pPr>
-      <w:bookmarkStart w:id="38" w:name="ref-6"/>
-      <w:r>
-        <w:rPr>
-          <w:sz w:val="19"/>
-        </w:rPr>
-        <w:t xml:space="preserve">[6]</w:t>
-      </w:r>
-      <w:bookmarkEnd w:id="38"/>
+      <w:bookmarkStart w:id="40" w:name="ref-7"/>
+      <w:r>
+        <w:rPr>
+          <w:sz w:val="19"/>
+        </w:rPr>
+        <w:t xml:space="preserve">[7]</w:t>
+      </w:r>
+      <w:bookmarkEnd w:id="40"/>
+      <w:r>
+        <w:rPr>
+          <w:sz w:val="19"/>
+        </w:rPr>
+        <w:t xml:space="preserve"> </w:t>
+      </w:r>
+      <w:r>
+        <w:rPr>
+          <w:sz w:val="19"/>
+        </w:rPr>
+        <w:t xml:space="preserve">Barua, A., Wang, L., &amp; Zhang, A. X. (2026).</w:t>
+      </w:r>
+      <w:r>
+        <w:rPr>
+          <w:sz w:val="19"/>
+        </w:rPr>
+        <w:t xml:space="preserve"> </w:t>
+      </w:r>
+      <w:hyperlink r:id="rId41">
+        <w:r>
+          <w:rPr>
+            <w:rStyle w:val="Hyperlink"/>
+            <w:iCs/>
+            <w:i/>
+            <w:sz w:val="19"/>
+          </w:rPr>
+          <w:t xml:space="preserve">Compass: Continuously Aligning Social Media Feeds via In-Situ Reflections</w:t>
+        </w:r>
+      </w:hyperlink>
+      <w:r>
+        <w:rPr>
+          <w:sz w:val="19"/>
+        </w:rPr>
+        <w:t xml:space="preserve">. UIST 2026; arXiv:2608.04274.</w:t>
+      </w:r>
+    </w:p>
+    <w:p>
+      <w:pPr>
+        <w:pStyle w:val="BodyText"/>
+        <w:keepLines/>
+        <w:widowControl/>
+        <w:spacing w:after="100" w:line="252" w:lineRule="auto"/>
+        <w:ind w:left="400" w:hanging="400"/>
+      </w:pPr>
+      <w:bookmarkStart w:id="42" w:name="ref-8"/>
+      <w:r>
+        <w:rPr>
+          <w:sz w:val="19"/>
+        </w:rPr>
+        <w:t xml:space="preserve">[8]</w:t>
+      </w:r>
+      <w:bookmarkEnd w:id="42"/>
       <w:r>
         <w:rPr>
           <w:sz w:val="19"/>
@@ -3622,7 +3777,7 @@
         </w:rPr>
         <w:t xml:space="preserve"> </w:t>
       </w:r>
-      <w:hyperlink r:id="rId39">
+      <w:hyperlink r:id="rId43">
         <w:r>
           <w:rPr>
             <w:rStyle w:val="Hyperlink"/>
@@ -3654,14 +3809,14 @@
         <w:spacing w:after="100" w:line="252" w:lineRule="auto"/>
         <w:ind w:left="400" w:hanging="400"/>
       </w:pPr>
-      <w:bookmarkStart w:id="40" w:name="ref-7"/>
-      <w:r>
-        <w:rPr>
-          <w:sz w:val="19"/>
-        </w:rPr>
-        <w:t xml:space="preserve">[7]</w:t>
-      </w:r>
-      <w:bookmarkEnd w:id="40"/>
+      <w:bookmarkStart w:id="44" w:name="ref-9"/>
+      <w:r>
+        <w:rPr>
+          <w:sz w:val="19"/>
+        </w:rPr>
+        <w:t xml:space="preserve">[9]</w:t>
+      </w:r>
+      <w:bookmarkEnd w:id="44"/>
       <w:r>
         <w:rPr>
           <w:sz w:val="19"/>
@@ -3680,7 +3835,7 @@
         </w:rPr>
         <w:t xml:space="preserve"> </w:t>
       </w:r>
-      <w:hyperlink r:id="rId41">
+      <w:hyperlink r:id="rId45">
         <w:r>
           <w:rPr>
             <w:rStyle w:val="Hyperlink"/>
@@ -3706,14 +3861,14 @@
         <w:spacing w:after="100" w:line="252" w:lineRule="auto"/>
         <w:ind w:left="400" w:hanging="400"/>
       </w:pPr>
-      <w:bookmarkStart w:id="42" w:name="ref-8"/>
-      <w:r>
-        <w:rPr>
-          <w:sz w:val="19"/>
-        </w:rPr>
-        <w:t xml:space="preserve">[8]</w:t>
-      </w:r>
-      <w:bookmarkEnd w:id="42"/>
+      <w:bookmarkStart w:id="46" w:name="ref-10"/>
+      <w:r>
+        <w:rPr>
+          <w:sz w:val="19"/>
+        </w:rPr>
+        <w:t xml:space="preserve">[10]</w:t>
+      </w:r>
+      <w:bookmarkEnd w:id="46"/>
       <w:r>
         <w:rPr>
           <w:sz w:val="19"/>
@@ -3732,7 +3887,7 @@
         </w:rPr>
         <w:t xml:space="preserve"> </w:t>
       </w:r>
-      <w:hyperlink r:id="rId43">
+      <w:hyperlink r:id="rId47">
         <w:r>
           <w:rPr>
             <w:rStyle w:val="Hyperlink"/>
@@ -3755,13 +3910,13 @@
         </w:rPr>
         <w:t xml:space="preserve"> </w:t>
       </w:r>
-      <w:hyperlink r:id="rId43">
+      <w:hyperlink r:id="rId48">
         <w:r>
           <w:rPr>
             <w:rStyle w:val="Hyperlink"/>
             <w:sz w:val="19"/>
           </w:rPr>
-          <w:t xml:space="preserve">doi:10.1145/3511808.3557624</w:t>
+          <w:t xml:space="preserve">Caption/category supplement</w:t>
         </w:r>
       </w:hyperlink>
       <w:r>
@@ -3779,14 +3934,14 @@
         <w:spacing w:after="100" w:line="252" w:lineRule="auto"/>
         <w:ind w:left="400" w:hanging="400"/>
       </w:pPr>
-      <w:bookmarkStart w:id="44" w:name="ref-9"/>
-      <w:r>
-        <w:rPr>
-          <w:sz w:val="19"/>
-        </w:rPr>
-        <w:t xml:space="preserve">[9]</w:t>
-      </w:r>
-      <w:bookmarkEnd w:id="44"/>
+      <w:bookmarkStart w:id="49" w:name="ref-11"/>
+      <w:r>
+        <w:rPr>
+          <w:sz w:val="19"/>
+        </w:rPr>
+        <w:t xml:space="preserve">[11]</w:t>
+      </w:r>
+      <w:bookmarkEnd w:id="49"/>
       <w:r>
         <w:rPr>
           <w:sz w:val="19"/>
@@ -3805,7 +3960,7 @@
         </w:rPr>
         <w:t xml:space="preserve"> </w:t>
       </w:r>
-      <w:hyperlink r:id="rId45">
+      <w:hyperlink r:id="rId50">
         <w:r>
           <w:rPr>
             <w:rStyle w:val="Hyperlink"/>
@@ -3831,14 +3986,14 @@
         <w:spacing w:after="100" w:line="252" w:lineRule="auto"/>
         <w:ind w:left="400" w:hanging="400"/>
       </w:pPr>
-      <w:bookmarkStart w:id="46" w:name="ref-10"/>
-      <w:r>
-        <w:rPr>
-          <w:sz w:val="19"/>
-        </w:rPr>
-        <w:t xml:space="preserve">[10]</w:t>
-      </w:r>
-      <w:bookmarkEnd w:id="46"/>
+      <w:bookmarkStart w:id="51" w:name="ref-12"/>
+      <w:r>
+        <w:rPr>
+          <w:sz w:val="19"/>
+        </w:rPr>
+        <w:t xml:space="preserve">[12]</w:t>
+      </w:r>
+      <w:bookmarkEnd w:id="51"/>
       <w:r>
         <w:rPr>
           <w:sz w:val="19"/>
@@ -3857,7 +4012,7 @@
         </w:rPr>
         <w:t xml:space="preserve"> </w:t>
       </w:r>
-      <w:hyperlink r:id="rId47">
+      <w:hyperlink r:id="rId52">
         <w:r>
           <w:rPr>
             <w:rStyle w:val="Hyperlink"/>
@@ -3875,8 +4030,8 @@
         <w:t xml:space="preserve">. NAACL 2024, pp. 1490–1504.</w:t>
       </w:r>
     </w:p>
-    <w:bookmarkEnd w:id="48"/>
-    <w:bookmarkEnd w:id="49"/>
+    <w:bookmarkEnd w:id="53"/>
+    <w:bookmarkEnd w:id="54"/>
     <w:sectPr>
       <w:headerReference w:type="default" r:id="rId9"/>
       <w:footerReference w:type="default" r:id="rId10"/>

</xml_diff>

<commit_message>
Clarify simulation mechanics and dataset coverage limits
</commit_message>
<xml_diff>
--- a/docs/project-plan/submission/Project_Plan_EN.docx
+++ b/docs/project-plan/submission/Project_Plan_EN.docx
@@ -2083,7 +2083,7 @@
         <w:widowControl/>
       </w:pPr>
       <w:r>
-        <w:t xml:space="preserve">This simulation separates viewing tendencies from adjustment goals. Rule-based, data-driven, LLM-based and hybrid users will be compared against available held-out logs, including probability calibration. Recommendation memory, exploration and feedback strength will vary across experiments. Watching upsetting videos can conflict with wanting fewer recommendations of them. Each policy receives only observable records, not hidden preferences or recommender parameters.</w:t>
+        <w:t xml:space="preserve">This simulation separates viewing tendencies from adjustment goals. The recommender will rank candidates using content relevance and past feedback, with exploration and decaying memory; viewing and negative signals update later rankings. A transparent version will serve as a baseline for a model trained on interaction histories. Rule-based, data-driven, LLM-based and hybrid users will be compared against available held-out logs, including probability calibration. We will also check whether changing the user model reverses which intervention performs best. Watching upsetting videos can conflict with wanting fewer recommendations of them. Each policy receives only observable records, not hidden preferences or recommender parameters.</w:t>
       </w:r>
     </w:p>
     <w:p>
@@ -2432,7 +2432,7 @@
         <w:widowControl/>
       </w:pPr>
       <w:r>
-        <w:t xml:space="preserve">We need interpretable content and interaction histories. We have obtained ShortVideo samples and KuaiRand-1K/Pure logs with supplementary captions and categories. Eight ShortVideo video–transcript pairs were retrieved and the videos decoded; pretrained semantic retrieval and an untrained user-response network also ran. These checks establish access and execution, not transcription accuracy, model validity or complete feed coverage.</w:t>
+        <w:t xml:space="preserve">We need interpretable content and interaction histories. We have obtained ShortVideo samples and KuaiRand-1K/Pure logs with supplementary captions and categories. Eight ShortVideo video–transcript pairs were retrieved and the videos decoded; pretrained semantic retrieval and an untrained user-response network also ran. These checks establish access and execution, not transcription accuracy, model validity or complete feed coverage. ShortVideo’s sampled histories may be discontinuous, so content and trajectory coverage need separate checks. KuaiRand’s random exposures come from a limited video pool, not a complete feed with personalisation disabled.</w:t>
       </w:r>
     </w:p>
     <w:p>

</xml_diff>